<commit_message>
Manual, LGPD e README alinhados ao modo de chamar nomes e às duas correções
O manual ainda descrevia a cerimônia como tela separada e não sabia dos
eventos rapido_demais/removido; a LGPD e o README seguiam a mesma versão
antiga. O mapa de estados também escondia metade de decidirRota: a checagem
dupla de 'problema', a cerimônia como sinal (não tela), e os dois laços que a
rota fecha sozinha — grade reabrindo por horário, sessão sobrevivendo ao
leitor caindo no meio da aula.

Co-Authored-By: Claude Sonnet 5 <noreply@anthropic.com>
</commit_message>
<xml_diff>
--- a/docs/Adsum-manual-e-LGPD.docx
+++ b/docs/Adsum-manual-e-LGPD.docx
@@ -523,19 +523,83 @@
           <w:sz w:val="22"/>
           <w:szCs w:val="22"/>
         </w:rPr>
-        <w:t xml:space="preserve">No primeiro dia ninguém tem crachá vinculado, e é a própria chamada que faz o vínculo. O professor encosta o crachá dele primeiro — é o que abre a aula. Depois, um por vez, os alunos encostam o deles: a tela mostra de quem é a vez, o crachá encostado passa a ser daquela pessoa, e a presença é contada no mesmo gesto. Cadastrar e fazer a chamada são a mesma coisa.</w:t>
-      </w:r>
-    </w:p>
-    <w:p>
-      <w:pPr>
-        <w:spacing w:after="160" w:line="276"/>
-      </w:pPr>
-      <w:r>
-        <w:rPr>
-          <w:sz w:val="22"/>
-          <w:szCs w:val="22"/>
-        </w:rPr>
-        <w:t xml:space="preserve">Um aluno pode ter mais de um crachá — segunda via, crachá antigo — e todos valem. Um crachá já vinculado a outra pessoa é recusado dizendo de quem é, e não em silêncio.</w:t>
+        <w:t xml:space="preserve">No primeiro dia ninguém tem crachá vinculado, e é a própria tela da chamada que faz o vínculo — não existe uma tela de cadastro à parte. O professor liga o interruptor "Chamar nomes" (ou clica numa linha da lista, ou usa as setas do teclado): a tela passa a mostrar um nome grande e a pedir o crachá daquela pessoa.</w:t>
+      </w:r>
+    </w:p>
+    <w:p>
+      <w:pPr>
+        <w:pStyle w:val="ListParagraph"/>
+        <w:numPr>
+          <w:ilvl w:val="0"/>
+          <w:numId w:val="2"/>
+        </w:numPr>
+        <w:spacing w:after="100" w:line="276"/>
+      </w:pPr>
+      <w:r>
+        <w:rPr>
+          <w:b/>
+          <w:bCs/>
+          <w:sz w:val="22"/>
+          <w:szCs w:val="22"/>
+        </w:rPr>
+        <w:t xml:space="preserve">Com alguém chamado, </w:t>
+      </w:r>
+      <w:r>
+        <w:rPr>
+          <w:sz w:val="22"/>
+          <w:szCs w:val="22"/>
+        </w:rPr>
+        <w:t xml:space="preserve">o próximo crachá desconhecido é dela — a tela vincula e conta presença no mesmo toque, sem perguntar de novo. Quem está com o crachá na mão está sendo observado, não é um palpite.</w:t>
+      </w:r>
+    </w:p>
+    <w:p>
+      <w:pPr>
+        <w:pStyle w:val="ListParagraph"/>
+        <w:numPr>
+          <w:ilvl w:val="0"/>
+          <w:numId w:val="2"/>
+        </w:numPr>
+        <w:spacing w:after="100" w:line="276"/>
+      </w:pPr>
+      <w:r>
+        <w:rPr>
+          <w:b/>
+          <w:bCs/>
+          <w:sz w:val="22"/>
+          <w:szCs w:val="22"/>
+        </w:rPr>
+        <w:t xml:space="preserve">Sem ninguém chamado — o padrão —, </w:t>
+      </w:r>
+      <w:r>
+        <w:rPr>
+          <w:sz w:val="22"/>
+          <w:szCs w:val="22"/>
+        </w:rPr>
+        <w:t xml:space="preserve">todo crachá desconhecido abre uma busca por nome, ali na hora, mesmo com a turma inteira ainda sem crachá. Um modo em que a tela adivinhava sozinha quem viria a seguir já existiu, e foi tirado por isso: adivinhar errado vincula o crachá de uma pessoa ao nome de outra sem ninguém ter pedido nada.</w:t>
+      </w:r>
+    </w:p>
+    <w:p>
+      <w:pPr>
+        <w:spacing w:after="160" w:line="276"/>
+      </w:pPr>
+      <w:r>
+        <w:rPr>
+          <w:sz w:val="22"/>
+          <w:szCs w:val="22"/>
+        </w:rPr>
+        <w:t xml:space="preserve">Um aluno pode ter mais de um crachá — segunda via, crachá antigo — e todos valem: chama-se o nome de novo e encosta-se o cartão novo. Um crachá já vinculado a outra pessoa é recusado dizendo de quem é, nunca em silêncio.</w:t>
+      </w:r>
+    </w:p>
+    <w:p>
+      <w:pPr>
+        <w:spacing w:after="160" w:line="276"/>
+      </w:pPr>
+      <w:r>
+        <w:rPr>
+          <w:sz w:val="22"/>
+          <w:szCs w:val="22"/>
+        </w:rPr>
+        <w:t xml:space="preserve">Um vínculo feito errado — crachá confirmado para a pessoa errada, ou o crachá de um colega que encostou por engano — se desfaz ali mesmo, num botão "Remover crachá" ao lado do nome, sem sair da chamada. O crachá volta a ser desconhecido e a pessoa volta para a fila; a presença que já havia sido gravada continua no registro, porque eventos não se apagam — só a ligação entre o crachá e o nome muda.</w:t>
       </w:r>
     </w:p>
     <w:p>
@@ -568,7 +632,19 @@
           <w:sz w:val="22"/>
           <w:szCs w:val="22"/>
         </w:rPr>
-        <w:t xml:space="preserve">Cada crachá encostado conta presença e mostra o nome. Encostar duas vezes não conta duas — a tela diz que já estava registrado. Um crachá que o programa não conhece abre uma busca por nome ali na hora: quem faltou no primeiro dia se cadastra no dia em que aparece, com a pessoa na frente.</w:t>
+        <w:t xml:space="preserve">Cada crachá encostado conta presença e mostra o nome. Encostar duas vezes não conta duas — a tela diz que já estava registrado. Um crachá que o programa não conhece abre uma busca por nome ali na hora, no modo comum: quem faltou no primeiro dia se cadastra no dia em que aparece, com a pessoa na frente. Quem está reconhecidamente faltando pode também ser chamado de propósito, do mesmo jeito do primeiro dia — inclusive semanas depois.</w:t>
+      </w:r>
+    </w:p>
+    <w:p>
+      <w:pPr>
+        <w:spacing w:after="160" w:line="276"/>
+      </w:pPr>
+      <w:r>
+        <w:rPr>
+          <w:sz w:val="22"/>
+          <w:szCs w:val="22"/>
+        </w:rPr>
+        <w:t xml:space="preserve">Dois crachás encostados quase juntos — menos de 400 milissegundos um do outro — não contam dois: o segundo é recusado, e a tela avisa "Dois crachás quase juntos". O limite existe contra passar dois cartões de uma vez, na pressa; ele não distingue fila apressada de má-fé, e não tenta — quem julga o que aconteceu é o professor, que está na sala.</w:t>
       </w:r>
     </w:p>
     <w:p>
@@ -614,6 +690,48 @@
           <w:szCs w:val="22"/>
         </w:rPr>
         <w:t xml:space="preserve">Com pasta escolhida, não há passo nenhum: cada presença já foi gravada no disco no momento em que aconteceu. Sem pasta, salvar é a ação da tela — e enquanto houver aula por salvar, o programa cobra, na tela de espera e ao fechar a aba.</w:t>
+      </w:r>
+    </w:p>
+    <w:p>
+      <w:pPr>
+        <w:pStyle w:val="Heading2"/>
+        <w:spacing w:after="140" w:before="320"/>
+      </w:pPr>
+      <w:r>
+        <w:t xml:space="preserve">2.5 Corrigir depois</w:t>
+      </w:r>
+    </w:p>
+    <w:p>
+      <w:pPr>
+        <w:spacing w:after="160" w:line="276"/>
+      </w:pPr>
+      <w:r>
+        <w:rPr>
+          <w:sz w:val="22"/>
+          <w:szCs w:val="22"/>
+        </w:rPr>
+        <w:t xml:space="preserve">A planilha do curso inteiro (Ajustes › Presenças) não é só para ler. No modo Editar, cada quadrado vira botão: uma falta vira presença confirmada à mão, e uma presença vira falta — para quando um crachá desconhecido foi confirmado para a pessoa errada, ou uma presença foi marcada à mão sem querer. As duas correções gravam um evento novo; o registro nunca reescreve uma linha antiga, e o quadrado corrigido continua identificável depois, para quem quiser auditar.</w:t>
+      </w:r>
+    </w:p>
+    <w:p>
+      <w:pPr>
+        <w:pStyle w:val="Heading2"/>
+        <w:spacing w:after="140" w:before="320"/>
+      </w:pPr>
+      <w:r>
+        <w:t xml:space="preserve">2.6 Mais de uma turma</w:t>
+      </w:r>
+    </w:p>
+    <w:p>
+      <w:pPr>
+        <w:spacing w:after="160" w:line="276"/>
+      </w:pPr>
+      <w:r>
+        <w:rPr>
+          <w:sz w:val="22"/>
+          <w:szCs w:val="22"/>
+        </w:rPr>
+        <w:t xml:space="preserve">Uma segunda turma se cadastra pelo mesmo caminho do primeiro dia: "Cadastrar nova turma", na tela de escolher qual turma chamar. Se a grade apontar duas turmas no mesmo horário, o Adsum avisa em vez de abrir uma e esconder a outra — quem falta em cada uma continua visível, e nenhuma fica esquecida por a outra ter chegado primeiro.</w:t>
       </w:r>
     </w:p>
     <w:p>
@@ -1955,7 +2073,7 @@
                 <w:sz w:val="20"/>
                 <w:szCs w:val="20"/>
               </w:rPr>
-              <w:t xml:space="preserve">ok, duplicado, desconhecido</w:t>
+              <w:t xml:space="preserve">ok, duplicado, desconhecido, rapido_demais, removido</w:t>
             </w:r>
           </w:p>
         </w:tc>
@@ -2078,6 +2196,63 @@
           <w:szCs w:val="22"/>
         </w:rPr>
         <w:t xml:space="preserve">O arquivo nunca é reescrito: cada presença acrescenta uma linha. Corrigir um nome ou uma matrícula na base corrige as exportações seguintes sem alterar uma linha do que já foi registrado.</w:t>
+      </w:r>
+    </w:p>
+    <w:p>
+      <w:pPr>
+        <w:spacing w:after="160" w:line="276"/>
+      </w:pPr>
+      <w:r>
+        <w:rPr>
+          <w:sz w:val="22"/>
+          <w:szCs w:val="22"/>
+        </w:rPr>
+        <w:t xml:space="preserve">Dois valores de </w:t>
+      </w:r>
+      <w:r>
+        <w:rPr>
+          <w:rFonts w:ascii="Courier New" w:cs="Courier New" w:eastAsia="Courier New" w:hAnsi="Courier New"/>
+          <w:sz w:val="20"/>
+          <w:szCs w:val="20"/>
+        </w:rPr>
+        <w:t xml:space="preserve">resultado</w:t>
+      </w:r>
+      <w:r>
+        <w:rPr>
+          <w:sz w:val="22"/>
+          <w:szCs w:val="22"/>
+        </w:rPr>
+        <w:t xml:space="preserve"> são recentes, e os dois são a mesma disciplina: até o crachá sendo recusado, ou uma marcação sendo desfeita, vira linha — nunca silêncio. </w:t>
+      </w:r>
+      <w:r>
+        <w:rPr>
+          <w:rFonts w:ascii="Courier New" w:cs="Courier New" w:eastAsia="Courier New" w:hAnsi="Courier New"/>
+          <w:sz w:val="20"/>
+          <w:szCs w:val="20"/>
+        </w:rPr>
+        <w:t xml:space="preserve">rapido_demais</w:t>
+      </w:r>
+      <w:r>
+        <w:rPr>
+          <w:sz w:val="22"/>
+          <w:szCs w:val="22"/>
+        </w:rPr>
+        <w:t xml:space="preserve"> é o segundo de dois crachás quase juntos, recusado pela regra dos 400 milissegundos (seção 2.3). </w:t>
+      </w:r>
+      <w:r>
+        <w:rPr>
+          <w:rFonts w:ascii="Courier New" w:cs="Courier New" w:eastAsia="Courier New" w:hAnsi="Courier New"/>
+          <w:sz w:val="20"/>
+          <w:szCs w:val="20"/>
+        </w:rPr>
+        <w:t xml:space="preserve">removido</w:t>
+      </w:r>
+      <w:r>
+        <w:rPr>
+          <w:sz w:val="22"/>
+          <w:szCs w:val="22"/>
+        </w:rPr>
+        <w:t xml:space="preserve"> é o professor tirando à mão, na planilha, uma presença que não devia ter sido contada — a leitura original do crachá continua no arquivo, só deixa de valer como presença.</w:t>
       </w:r>
     </w:p>
     <w:p>
@@ -3582,7 +3757,103 @@
                 <w:sz w:val="20"/>
                 <w:szCs w:val="20"/>
               </w:rPr>
-              <w:t xml:space="preserve">A tela diz, em vez de esperar um crachá que não vai chegar. O diagnóstico mostra a última leitura crua.</w:t>
+              <w:t xml:space="preserve">A tela diz, em vez de esperar um crachá que não vai chegar — mesmo no meio de uma chamada aberta, que continua esperando no fundo e reaparece sozinha assim que o leitor volta. Nada se perde.</w:t>
+            </w:r>
+          </w:p>
+        </w:tc>
+      </w:tr>
+      <w:tr>
+        <w:tc>
+          <w:tcPr>
+            <w:tcW w:type="dxa" w:w="2600"/>
+            <w:tcMar>
+              <w:top w:type="dxa" w:w="120"/>
+              <w:left w:type="dxa" w:w="160"/>
+              <w:bottom w:type="dxa" w:w="120"/>
+              <w:right w:type="dxa" w:w="160"/>
+            </w:tcMar>
+          </w:tcPr>
+          <w:p>
+            <w:pPr>
+              <w:spacing w:after="0" w:line="260"/>
+            </w:pPr>
+            <w:r>
+              <w:rPr>
+                <w:sz w:val="20"/>
+                <w:szCs w:val="20"/>
+              </w:rPr>
+              <w:t xml:space="preserve">Dois crachás quase juntos</w:t>
+            </w:r>
+          </w:p>
+        </w:tc>
+        <w:tc>
+          <w:tcPr>
+            <w:tcW w:type="dxa" w:w="6426"/>
+            <w:tcMar>
+              <w:top w:type="dxa" w:w="120"/>
+              <w:left w:type="dxa" w:w="160"/>
+              <w:bottom w:type="dxa" w:w="120"/>
+              <w:right w:type="dxa" w:w="160"/>
+            </w:tcMar>
+          </w:tcPr>
+          <w:p>
+            <w:pPr>
+              <w:spacing w:after="0" w:line="260"/>
+            </w:pPr>
+            <w:r>
+              <w:rPr>
+                <w:sz w:val="20"/>
+                <w:szCs w:val="20"/>
+              </w:rPr>
+              <w:t xml:space="preserve">O segundo não conta, e a tela avisa na hora. O programa não distingue fila apressada de má-fé — quem julga é o professor, que está na sala.</w:t>
+            </w:r>
+          </w:p>
+        </w:tc>
+      </w:tr>
+      <w:tr>
+        <w:tc>
+          <w:tcPr>
+            <w:tcW w:type="dxa" w:w="2600"/>
+            <w:tcMar>
+              <w:top w:type="dxa" w:w="120"/>
+              <w:left w:type="dxa" w:w="160"/>
+              <w:bottom w:type="dxa" w:w="120"/>
+              <w:right w:type="dxa" w:w="160"/>
+            </w:tcMar>
+          </w:tcPr>
+          <w:p>
+            <w:pPr>
+              <w:spacing w:after="0" w:line="260"/>
+            </w:pPr>
+            <w:r>
+              <w:rPr>
+                <w:sz w:val="20"/>
+                <w:szCs w:val="20"/>
+              </w:rPr>
+              <w:t xml:space="preserve">Uma presença foi marcada errada</w:t>
+            </w:r>
+          </w:p>
+        </w:tc>
+        <w:tc>
+          <w:tcPr>
+            <w:tcW w:type="dxa" w:w="6426"/>
+            <w:tcMar>
+              <w:top w:type="dxa" w:w="120"/>
+              <w:left w:type="dxa" w:w="160"/>
+              <w:bottom w:type="dxa" w:w="120"/>
+              <w:right w:type="dxa" w:w="160"/>
+            </w:tcMar>
+          </w:tcPr>
+          <w:p>
+            <w:pPr>
+              <w:spacing w:after="0" w:line="260"/>
+            </w:pPr>
+            <w:r>
+              <w:rPr>
+                <w:sz w:val="20"/>
+                <w:szCs w:val="20"/>
+              </w:rPr>
+              <w:t xml:space="preserve">Corrige-se na planilha (Ajustes › Presenças), no modo Editar: a presença vira falta com um toque, sem apagar a leitura original do crachá.</w:t>
             </w:r>
           </w:p>
         </w:tc>
@@ -3673,6 +3944,18 @@
           <w:szCs w:val="22"/>
         </w:rPr>
         <w:t xml:space="preserve">. Ele é gravado a cada mudança, para que quem abrir a pasta daqui a um ano — ou quem a receber de um colega — não precise deste documento à mão.</w:t>
+      </w:r>
+    </w:p>
+    <w:p>
+      <w:pPr>
+        <w:spacing w:after="160" w:line="276"/>
+      </w:pPr>
+      <w:r>
+        <w:rPr>
+          <w:sz w:val="22"/>
+          <w:szCs w:val="22"/>
+        </w:rPr>
+        <w:t xml:space="preserve">Um diagnóstico técnico — capacidades do navegador, estado do leitor, última leitura crua — fica atrás da engrenagem, discreto: ninguém precisa saber que ele existe até precisar dele.</w:t>
       </w:r>
     </w:p>
     <w:p>

</xml_diff>

<commit_message>
Sumário do manual deixa de ficar vazio, e páginas param de quebrar com espaço em branco
O TableOfContents do docx só aparece preenchido depois de alguém mandar
atualizar o campo — em qualquer visualizador que não faça isso, ficava
vazio. Agora h1/h2 alimentam o sumário via cachedEntries na mesma
passada em que constroem os títulos, e features.updateFields faz o
Word recalcular os números sozinho ao abrir.

Os espaços em branco vinham de quebra de página como parágrafo solto
antes do título (troquei por pageBreakBefore no próprio título),
títulos podendo ficar órfãos no fim da página (keepNext/keepLines), e
linhas de tabela partindo no meio entre páginas (cantSplit).

Co-Authored-By: Claude Sonnet 5 <noreply@anthropic.com>
</commit_message>
<xml_diff>
--- a/docs/Adsum-manual-e-LGPD.docx
+++ b/docs/Adsum-manual-e-LGPD.docx
@@ -70,6 +70,9 @@
         <w:gridCol w:w="9026"/>
       </w:tblGrid>
       <w:tr>
+        <w:trPr>
+          <w:cantSplit/>
+        </w:trPr>
         <w:tc>
           <w:tcPr>
             <w:tcW w:type="dxa" w:w="9026"/>
@@ -83,6 +86,7 @@
           </w:tcPr>
           <w:p>
             <w:pPr>
+              <w:widowControl/>
               <w:spacing w:after="160" w:line="276"/>
             </w:pPr>
             <w:r>
@@ -104,6 +108,7 @@
           </w:p>
           <w:p>
             <w:pPr>
+              <w:widowControl/>
               <w:spacing w:after="0"/>
             </w:pPr>
             <w:r>
@@ -118,13 +123,11 @@
       </w:tr>
     </w:tbl>
     <w:p>
-      <w:r>
-        <w:br w:type="page"/>
-      </w:r>
-    </w:p>
-    <w:p>
       <w:pPr>
         <w:pStyle w:val="Heading1"/>
+        <w:keepNext/>
+        <w:pageBreakBefore/>
+        <w:widowControl/>
         <w:spacing w:after="200" w:before="400"/>
       </w:pPr>
       <w:r>
@@ -137,13 +140,359 @@
       </w:sdtPr>
       <w:sdtContent>
         <w:p>
+          <w:pPr>
+            <w:pStyle w:val="TOC1"/>
+            <w:tabs>
+              <w:tab w:val="clear" w:pos="9026"/>
+              <w:tab w:val="right" w:pos="9025" w:leader="dot"/>
+            </w:tabs>
+          </w:pPr>
           <w:r>
             <w:fldChar w:fldCharType="begin" w:dirty="true"/>
             <w:instrText xml:space="preserve">TOC \o "1-2"</w:instrText>
             <w:fldChar w:fldCharType="separate"/>
           </w:r>
+          <w:r>
+            <w:t xml:space="default">1. O que é o Adsum</w:t>
+            <w:tab/>
+            <w:t xml:space="default"/>
+          </w:r>
         </w:p>
         <w:p>
+          <w:pPr>
+            <w:pStyle w:val="TOC2"/>
+            <w:tabs>
+              <w:tab w:val="clear" w:pos="8786"/>
+              <w:tab w:val="right" w:pos="9025" w:leader="dot"/>
+            </w:tabs>
+          </w:pPr>
+          <w:r>
+            <w:t xml:space="default">O que o Adsum não é</w:t>
+            <w:tab/>
+            <w:t xml:space="default"/>
+          </w:r>
+        </w:p>
+        <w:p>
+          <w:pPr>
+            <w:pStyle w:val="TOC1"/>
+            <w:tabs>
+              <w:tab w:val="clear" w:pos="9026"/>
+              <w:tab w:val="right" w:pos="9025" w:leader="dot"/>
+            </w:tabs>
+          </w:pPr>
+          <w:r>
+            <w:t xml:space="default">2. Como se usa</w:t>
+            <w:tab/>
+            <w:t xml:space="default"/>
+          </w:r>
+        </w:p>
+        <w:p>
+          <w:pPr>
+            <w:pStyle w:val="TOC2"/>
+            <w:tabs>
+              <w:tab w:val="clear" w:pos="8786"/>
+              <w:tab w:val="right" w:pos="9025" w:leader="dot"/>
+            </w:tabs>
+          </w:pPr>
+          <w:r>
+            <w:t xml:space="default">2.1 Antes do primeiro dia</w:t>
+            <w:tab/>
+            <w:t xml:space="default"/>
+          </w:r>
+        </w:p>
+        <w:p>
+          <w:pPr>
+            <w:pStyle w:val="TOC2"/>
+            <w:tabs>
+              <w:tab w:val="clear" w:pos="8786"/>
+              <w:tab w:val="right" w:pos="9025" w:leader="dot"/>
+            </w:tabs>
+          </w:pPr>
+          <w:r>
+            <w:t xml:space="default">2.2 O primeiro dia</w:t>
+            <w:tab/>
+            <w:t xml:space="default"/>
+          </w:r>
+        </w:p>
+        <w:p>
+          <w:pPr>
+            <w:pStyle w:val="TOC2"/>
+            <w:tabs>
+              <w:tab w:val="clear" w:pos="8786"/>
+              <w:tab w:val="right" w:pos="9025" w:leader="dot"/>
+            </w:tabs>
+          </w:pPr>
+          <w:r>
+            <w:t xml:space="default">2.3 Um dia comum</w:t>
+            <w:tab/>
+            <w:t xml:space="default"/>
+          </w:r>
+        </w:p>
+        <w:p>
+          <w:pPr>
+            <w:pStyle w:val="TOC2"/>
+            <w:tabs>
+              <w:tab w:val="clear" w:pos="8786"/>
+              <w:tab w:val="right" w:pos="9025" w:leader="dot"/>
+            </w:tabs>
+          </w:pPr>
+          <w:r>
+            <w:t xml:space="default">2.4 O fim da aula</w:t>
+            <w:tab/>
+            <w:t xml:space="default"/>
+          </w:r>
+        </w:p>
+        <w:p>
+          <w:pPr>
+            <w:pStyle w:val="TOC2"/>
+            <w:tabs>
+              <w:tab w:val="clear" w:pos="8786"/>
+              <w:tab w:val="right" w:pos="9025" w:leader="dot"/>
+            </w:tabs>
+          </w:pPr>
+          <w:r>
+            <w:t xml:space="default">2.5 Corrigir depois</w:t>
+            <w:tab/>
+            <w:t xml:space="default"/>
+          </w:r>
+        </w:p>
+        <w:p>
+          <w:pPr>
+            <w:pStyle w:val="TOC2"/>
+            <w:tabs>
+              <w:tab w:val="clear" w:pos="8786"/>
+              <w:tab w:val="right" w:pos="9025" w:leader="dot"/>
+            </w:tabs>
+          </w:pPr>
+          <w:r>
+            <w:t xml:space="default">2.6 Mais de uma turma</w:t>
+            <w:tab/>
+            <w:t xml:space="default"/>
+          </w:r>
+        </w:p>
+        <w:p>
+          <w:pPr>
+            <w:pStyle w:val="TOC1"/>
+            <w:tabs>
+              <w:tab w:val="clear" w:pos="9026"/>
+              <w:tab w:val="right" w:pos="9025" w:leader="dot"/>
+            </w:tabs>
+          </w:pPr>
+          <w:r>
+            <w:t xml:space="default">3. Onde os dados ficam</w:t>
+            <w:tab/>
+            <w:t xml:space="default"/>
+          </w:r>
+        </w:p>
+        <w:p>
+          <w:pPr>
+            <w:pStyle w:val="TOC1"/>
+            <w:tabs>
+              <w:tab w:val="clear" w:pos="9026"/>
+              <w:tab w:val="right" w:pos="9025" w:leader="dot"/>
+            </w:tabs>
+          </w:pPr>
+          <w:r>
+            <w:t xml:space="default">4. Que dados o Adsum trata — e quais não</w:t>
+            <w:tab/>
+            <w:t xml:space="default"/>
+          </w:r>
+        </w:p>
+        <w:p>
+          <w:pPr>
+            <w:pStyle w:val="TOC2"/>
+            <w:tabs>
+              <w:tab w:val="clear" w:pos="8786"/>
+              <w:tab w:val="right" w:pos="9025" w:leader="dot"/>
+            </w:tabs>
+          </w:pPr>
+          <w:r>
+            <w:t xml:space="default">4.1 O que é lido do crachá</w:t>
+            <w:tab/>
+            <w:t xml:space="default"/>
+          </w:r>
+        </w:p>
+        <w:p>
+          <w:pPr>
+            <w:pStyle w:val="TOC2"/>
+            <w:tabs>
+              <w:tab w:val="clear" w:pos="8786"/>
+              <w:tab w:val="right" w:pos="9025" w:leader="dot"/>
+            </w:tabs>
+          </w:pPr>
+          <w:r>
+            <w:t xml:space="default">4.2 O que vem da lista do SIGAA</w:t>
+            <w:tab/>
+            <w:t xml:space="default"/>
+          </w:r>
+        </w:p>
+        <w:p>
+          <w:pPr>
+            <w:pStyle w:val="TOC2"/>
+            <w:tabs>
+              <w:tab w:val="clear" w:pos="8786"/>
+              <w:tab w:val="right" w:pos="9025" w:leader="dot"/>
+            </w:tabs>
+          </w:pPr>
+          <w:r>
+            <w:t xml:space="default">4.3 O que fica gravado, campo por campo</w:t>
+            <w:tab/>
+            <w:t xml:space="default"/>
+          </w:r>
+        </w:p>
+        <w:p>
+          <w:pPr>
+            <w:pStyle w:val="TOC2"/>
+            <w:tabs>
+              <w:tab w:val="clear" w:pos="8786"/>
+              <w:tab w:val="right" w:pos="9025" w:leader="dot"/>
+            </w:tabs>
+          </w:pPr>
+          <w:r>
+            <w:t xml:space="default">4.4 O que o programa deliberadamente não faz</w:t>
+            <w:tab/>
+            <w:t xml:space="default"/>
+          </w:r>
+        </w:p>
+        <w:p>
+          <w:pPr>
+            <w:pStyle w:val="TOC1"/>
+            <w:tabs>
+              <w:tab w:val="clear" w:pos="9026"/>
+              <w:tab w:val="right" w:pos="9025" w:leader="dot"/>
+            </w:tabs>
+          </w:pPr>
+          <w:r>
+            <w:t xml:space="default">5. O tratamento, para fins de LGPD</w:t>
+            <w:tab/>
+            <w:t xml:space="default"/>
+          </w:r>
+        </w:p>
+        <w:p>
+          <w:pPr>
+            <w:pStyle w:val="TOC2"/>
+            <w:tabs>
+              <w:tab w:val="clear" w:pos="8786"/>
+              <w:tab w:val="right" w:pos="9025" w:leader="dot"/>
+            </w:tabs>
+          </w:pPr>
+          <w:r>
+            <w:t xml:space="default">5.1 Finalidade</w:t>
+            <w:tab/>
+            <w:t xml:space="default"/>
+          </w:r>
+        </w:p>
+        <w:p>
+          <w:pPr>
+            <w:pStyle w:val="TOC2"/>
+            <w:tabs>
+              <w:tab w:val="clear" w:pos="8786"/>
+              <w:tab w:val="right" w:pos="9025" w:leader="dot"/>
+            </w:tabs>
+          </w:pPr>
+          <w:r>
+            <w:t xml:space="default">5.2 Dados tratados e minimização</w:t>
+            <w:tab/>
+            <w:t xml:space="default"/>
+          </w:r>
+        </w:p>
+        <w:p>
+          <w:pPr>
+            <w:pStyle w:val="TOC2"/>
+            <w:tabs>
+              <w:tab w:val="clear" w:pos="8786"/>
+              <w:tab w:val="right" w:pos="9025" w:leader="dot"/>
+            </w:tabs>
+          </w:pPr>
+          <w:r>
+            <w:t xml:space="default">5.3 Quem faz o quê</w:t>
+            <w:tab/>
+            <w:t xml:space="default"/>
+          </w:r>
+        </w:p>
+        <w:p>
+          <w:pPr>
+            <w:pStyle w:val="TOC2"/>
+            <w:tabs>
+              <w:tab w:val="clear" w:pos="8786"/>
+              <w:tab w:val="right" w:pos="9025" w:leader="dot"/>
+            </w:tabs>
+          </w:pPr>
+          <w:r>
+            <w:t xml:space="default">5.4 Retenção e eliminação</w:t>
+            <w:tab/>
+            <w:t xml:space="default"/>
+          </w:r>
+        </w:p>
+        <w:p>
+          <w:pPr>
+            <w:pStyle w:val="TOC2"/>
+            <w:tabs>
+              <w:tab w:val="clear" w:pos="8786"/>
+              <w:tab w:val="right" w:pos="9025" w:leader="dot"/>
+            </w:tabs>
+          </w:pPr>
+          <w:r>
+            <w:t xml:space="default">5.5 Compartilhamento</w:t>
+            <w:tab/>
+            <w:t xml:space="default"/>
+          </w:r>
+        </w:p>
+        <w:p>
+          <w:pPr>
+            <w:pStyle w:val="TOC2"/>
+            <w:tabs>
+              <w:tab w:val="clear" w:pos="8786"/>
+              <w:tab w:val="right" w:pos="9025" w:leader="dot"/>
+            </w:tabs>
+          </w:pPr>
+          <w:r>
+            <w:t xml:space="default">5.6 Segurança</w:t>
+            <w:tab/>
+            <w:t xml:space="default"/>
+          </w:r>
+        </w:p>
+        <w:p>
+          <w:pPr>
+            <w:pStyle w:val="TOC2"/>
+            <w:tabs>
+              <w:tab w:val="clear" w:pos="8786"/>
+              <w:tab w:val="right" w:pos="9025" w:leader="dot"/>
+            </w:tabs>
+          </w:pPr>
+          <w:r>
+            <w:t xml:space="default">5.7 Direitos dos titulares</w:t>
+            <w:tab/>
+            <w:t xml:space="default"/>
+          </w:r>
+        </w:p>
+        <w:p>
+          <w:pPr>
+            <w:pStyle w:val="TOC1"/>
+            <w:tabs>
+              <w:tab w:val="clear" w:pos="9026"/>
+              <w:tab w:val="right" w:pos="9025" w:leader="dot"/>
+            </w:tabs>
+          </w:pPr>
+          <w:r>
+            <w:t xml:space="default">6. Quando dá errado</w:t>
+            <w:tab/>
+            <w:t xml:space="default"/>
+          </w:r>
+        </w:p>
+        <w:p>
+          <w:pPr>
+            <w:pStyle w:val="TOC1"/>
+            <w:tabs>
+              <w:tab w:val="clear" w:pos="9026"/>
+              <w:tab w:val="right" w:pos="9025" w:leader="dot"/>
+            </w:tabs>
+          </w:pPr>
+          <w:r>
+            <w:t xml:space="default">7. Limites conhecidos</w:t>
+            <w:tab/>
+            <w:t xml:space="default"/>
+          </w:r>
           <w:r>
             <w:fldChar w:fldCharType="end"/>
           </w:r>
@@ -151,13 +500,12 @@
       </w:sdtContent>
     </w:sdt>
     <w:p>
-      <w:r>
-        <w:br w:type="page"/>
-      </w:r>
-    </w:p>
-    <w:p>
       <w:pPr>
         <w:pStyle w:val="Heading1"/>
+        <w:keepNext/>
+        <w:keepLines/>
+        <w:pageBreakBefore/>
+        <w:widowControl/>
         <w:spacing w:after="200" w:before="400"/>
       </w:pPr>
       <w:r>
@@ -166,6 +514,7 @@
     </w:p>
     <w:p>
       <w:pPr>
+        <w:widowControl/>
         <w:spacing w:after="160" w:line="276"/>
       </w:pPr>
       <w:r>
@@ -178,6 +527,7 @@
     </w:p>
     <w:p>
       <w:pPr>
+        <w:widowControl/>
         <w:spacing w:after="160" w:line="276"/>
       </w:pPr>
       <w:r>
@@ -191,6 +541,7 @@
     <w:p>
       <w:pPr>
         <w:pStyle w:val="ListParagraph"/>
+        <w:widowControl/>
         <w:numPr>
           <w:ilvl w:val="0"/>
           <w:numId w:val="2"/>
@@ -217,6 +568,7 @@
     <w:p>
       <w:pPr>
         <w:pStyle w:val="ListParagraph"/>
+        <w:widowControl/>
         <w:numPr>
           <w:ilvl w:val="0"/>
           <w:numId w:val="2"/>
@@ -243,6 +595,7 @@
     <w:p>
       <w:pPr>
         <w:pStyle w:val="ListParagraph"/>
+        <w:widowControl/>
         <w:numPr>
           <w:ilvl w:val="0"/>
           <w:numId w:val="2"/>
@@ -268,6 +621,7 @@
     </w:p>
     <w:p>
       <w:pPr>
+        <w:widowControl/>
         <w:spacing w:after="160" w:line="276"/>
       </w:pPr>
       <w:r>
@@ -281,6 +635,9 @@
     <w:p>
       <w:pPr>
         <w:pStyle w:val="Heading2"/>
+        <w:keepNext/>
+        <w:keepLines/>
+        <w:widowControl/>
         <w:spacing w:after="140" w:before="320"/>
       </w:pPr>
       <w:r>
@@ -289,6 +646,7 @@
     </w:p>
     <w:p>
       <w:pPr>
+        <w:widowControl/>
         <w:spacing w:after="160" w:line="276"/>
       </w:pPr>
       <w:r>
@@ -300,13 +658,12 @@
       </w:r>
     </w:p>
     <w:p>
-      <w:r>
-        <w:br w:type="page"/>
-      </w:r>
-    </w:p>
-    <w:p>
       <w:pPr>
         <w:pStyle w:val="Heading1"/>
+        <w:keepNext/>
+        <w:keepLines/>
+        <w:pageBreakBefore/>
+        <w:widowControl/>
         <w:spacing w:after="200" w:before="400"/>
       </w:pPr>
       <w:r>
@@ -315,6 +672,7 @@
     </w:p>
     <w:p>
       <w:pPr>
+        <w:widowControl/>
         <w:spacing w:after="160" w:line="276"/>
       </w:pPr>
       <w:r>
@@ -341,6 +699,9 @@
         <w:gridCol w:w="9026"/>
       </w:tblGrid>
       <w:tr>
+        <w:trPr>
+          <w:cantSplit/>
+        </w:trPr>
         <w:tc>
           <w:tcPr>
             <w:tcW w:type="dxa" w:w="9026"/>
@@ -354,6 +715,7 @@
           </w:tcPr>
           <w:p>
             <w:pPr>
+              <w:widowControl/>
               <w:spacing w:after="0"/>
             </w:pPr>
             <w:r>
@@ -393,6 +755,7 @@
     </w:tbl>
     <w:p>
       <w:pPr>
+        <w:widowControl/>
         <w:spacing w:after="160" w:line="276"/>
       </w:pPr>
       <w:r>
@@ -406,6 +769,9 @@
     <w:p>
       <w:pPr>
         <w:pStyle w:val="Heading2"/>
+        <w:keepNext/>
+        <w:keepLines/>
+        <w:widowControl/>
         <w:spacing w:after="140" w:before="320"/>
       </w:pPr>
       <w:r>
@@ -414,6 +780,7 @@
     </w:p>
     <w:p>
       <w:pPr>
+        <w:widowControl/>
         <w:spacing w:after="160" w:line="276"/>
       </w:pPr>
       <w:r>
@@ -435,6 +802,7 @@
     </w:p>
     <w:p>
       <w:pPr>
+        <w:widowControl/>
         <w:spacing w:after="160" w:line="276"/>
       </w:pPr>
       <w:r>
@@ -486,6 +854,7 @@
     </w:p>
     <w:p>
       <w:pPr>
+        <w:widowControl/>
         <w:spacing w:after="160" w:line="276"/>
       </w:pPr>
       <w:r>
@@ -508,6 +877,9 @@
     <w:p>
       <w:pPr>
         <w:pStyle w:val="Heading2"/>
+        <w:keepNext/>
+        <w:keepLines/>
+        <w:widowControl/>
         <w:spacing w:after="140" w:before="320"/>
       </w:pPr>
       <w:r>
@@ -516,6 +888,7 @@
     </w:p>
     <w:p>
       <w:pPr>
+        <w:widowControl/>
         <w:spacing w:after="160" w:line="276"/>
       </w:pPr>
       <w:r>
@@ -529,6 +902,7 @@
     <w:p>
       <w:pPr>
         <w:pStyle w:val="ListParagraph"/>
+        <w:widowControl/>
         <w:numPr>
           <w:ilvl w:val="0"/>
           <w:numId w:val="2"/>
@@ -555,6 +929,7 @@
     <w:p>
       <w:pPr>
         <w:pStyle w:val="ListParagraph"/>
+        <w:widowControl/>
         <w:numPr>
           <w:ilvl w:val="0"/>
           <w:numId w:val="2"/>
@@ -580,6 +955,7 @@
     </w:p>
     <w:p>
       <w:pPr>
+        <w:widowControl/>
         <w:spacing w:after="160" w:line="276"/>
       </w:pPr>
       <w:r>
@@ -592,6 +968,7 @@
     </w:p>
     <w:p>
       <w:pPr>
+        <w:widowControl/>
         <w:spacing w:after="160" w:line="276"/>
       </w:pPr>
       <w:r>
@@ -605,6 +982,9 @@
     <w:p>
       <w:pPr>
         <w:pStyle w:val="Heading2"/>
+        <w:keepNext/>
+        <w:keepLines/>
+        <w:widowControl/>
         <w:spacing w:after="140" w:before="320"/>
       </w:pPr>
       <w:r>
@@ -613,6 +993,7 @@
     </w:p>
     <w:p>
       <w:pPr>
+        <w:widowControl/>
         <w:spacing w:after="160" w:line="276"/>
       </w:pPr>
       <w:r>
@@ -625,6 +1006,7 @@
     </w:p>
     <w:p>
       <w:pPr>
+        <w:widowControl/>
         <w:spacing w:after="160" w:line="276"/>
       </w:pPr>
       <w:r>
@@ -637,6 +1019,7 @@
     </w:p>
     <w:p>
       <w:pPr>
+        <w:widowControl/>
         <w:spacing w:after="160" w:line="276"/>
       </w:pPr>
       <w:r>
@@ -649,6 +1032,7 @@
     </w:p>
     <w:p>
       <w:pPr>
+        <w:widowControl/>
         <w:spacing w:after="160" w:line="276"/>
       </w:pPr>
       <w:r>
@@ -662,6 +1046,9 @@
     <w:p>
       <w:pPr>
         <w:pStyle w:val="Heading2"/>
+        <w:keepNext/>
+        <w:keepLines/>
+        <w:widowControl/>
         <w:spacing w:after="140" w:before="320"/>
       </w:pPr>
       <w:r>
@@ -670,6 +1057,7 @@
     </w:p>
     <w:p>
       <w:pPr>
+        <w:widowControl/>
         <w:spacing w:after="160" w:line="276"/>
       </w:pPr>
       <w:r>
@@ -682,6 +1070,7 @@
     </w:p>
     <w:p>
       <w:pPr>
+        <w:widowControl/>
         <w:spacing w:after="160" w:line="276"/>
       </w:pPr>
       <w:r>
@@ -695,6 +1084,9 @@
     <w:p>
       <w:pPr>
         <w:pStyle w:val="Heading2"/>
+        <w:keepNext/>
+        <w:keepLines/>
+        <w:widowControl/>
         <w:spacing w:after="140" w:before="320"/>
       </w:pPr>
       <w:r>
@@ -703,6 +1095,7 @@
     </w:p>
     <w:p>
       <w:pPr>
+        <w:widowControl/>
         <w:spacing w:after="160" w:line="276"/>
       </w:pPr>
       <w:r>
@@ -716,6 +1109,9 @@
     <w:p>
       <w:pPr>
         <w:pStyle w:val="Heading2"/>
+        <w:keepNext/>
+        <w:keepLines/>
+        <w:widowControl/>
         <w:spacing w:after="140" w:before="320"/>
       </w:pPr>
       <w:r>
@@ -724,6 +1120,7 @@
     </w:p>
     <w:p>
       <w:pPr>
+        <w:widowControl/>
         <w:spacing w:after="160" w:line="276"/>
       </w:pPr>
       <w:r>
@@ -735,13 +1132,12 @@
       </w:r>
     </w:p>
     <w:p>
-      <w:r>
-        <w:br w:type="page"/>
-      </w:r>
-    </w:p>
-    <w:p>
       <w:pPr>
         <w:pStyle w:val="Heading1"/>
+        <w:keepNext/>
+        <w:keepLines/>
+        <w:pageBreakBefore/>
+        <w:widowControl/>
         <w:spacing w:after="200" w:before="400"/>
       </w:pPr>
       <w:r>
@@ -750,6 +1146,7 @@
     </w:p>
     <w:p>
       <w:pPr>
+        <w:widowControl/>
         <w:spacing w:after="160" w:line="276"/>
       </w:pPr>
       <w:r>
@@ -762,6 +1159,7 @@
     </w:p>
     <w:p>
       <w:pPr>
+        <w:widowControl/>
         <w:spacing w:after="160" w:line="276"/>
       </w:pPr>
       <w:r>
@@ -790,6 +1188,7 @@
       </w:tblGrid>
       <w:tr>
         <w:trPr>
+          <w:cantSplit/>
           <w:tblHeader/>
         </w:trPr>
         <w:tc>
@@ -846,6 +1245,9 @@
         </w:tc>
       </w:tr>
       <w:tr>
+        <w:trPr>
+          <w:cantSplit/>
+        </w:trPr>
         <w:tc>
           <w:tcPr>
             <w:tcW w:type="dxa" w:w="2400"/>
@@ -895,6 +1297,9 @@
         </w:tc>
       </w:tr>
       <w:tr>
+        <w:trPr>
+          <w:cantSplit/>
+        </w:trPr>
         <w:tc>
           <w:tcPr>
             <w:tcW w:type="dxa" w:w="2400"/>
@@ -944,6 +1349,9 @@
         </w:tc>
       </w:tr>
       <w:tr>
+        <w:trPr>
+          <w:cantSplit/>
+        </w:trPr>
         <w:tc>
           <w:tcPr>
             <w:tcW w:type="dxa" w:w="2400"/>
@@ -993,6 +1401,9 @@
         </w:tc>
       </w:tr>
       <w:tr>
+        <w:trPr>
+          <w:cantSplit/>
+        </w:trPr>
         <w:tc>
           <w:tcPr>
             <w:tcW w:type="dxa" w:w="2400"/>
@@ -1042,6 +1453,9 @@
         </w:tc>
       </w:tr>
       <w:tr>
+        <w:trPr>
+          <w:cantSplit/>
+        </w:trPr>
         <w:tc>
           <w:tcPr>
             <w:tcW w:type="dxa" w:w="2400"/>
@@ -1091,6 +1505,9 @@
         </w:tc>
       </w:tr>
       <w:tr>
+        <w:trPr>
+          <w:cantSplit/>
+        </w:trPr>
         <w:tc>
           <w:tcPr>
             <w:tcW w:type="dxa" w:w="2400"/>
@@ -1142,6 +1559,7 @@
     </w:tbl>
     <w:p>
       <w:pPr>
+        <w:widowControl/>
         <w:spacing w:after="160" w:line="276"/>
       </w:pPr>
       <w:r>
@@ -1154,6 +1572,7 @@
     </w:p>
     <w:p>
       <w:pPr>
+        <w:widowControl/>
         <w:spacing w:after="160" w:line="276"/>
       </w:pPr>
       <w:r>
@@ -1175,6 +1594,7 @@
     </w:p>
     <w:p>
       <w:pPr>
+        <w:widowControl/>
         <w:spacing w:after="160" w:line="276"/>
       </w:pPr>
       <w:r>
@@ -1195,13 +1615,12 @@
       </w:r>
     </w:p>
     <w:p>
-      <w:r>
-        <w:br w:type="page"/>
-      </w:r>
-    </w:p>
-    <w:p>
       <w:pPr>
         <w:pStyle w:val="Heading1"/>
+        <w:keepNext/>
+        <w:keepLines/>
+        <w:pageBreakBefore/>
+        <w:widowControl/>
         <w:spacing w:after="200" w:before="400"/>
       </w:pPr>
       <w:r>
@@ -1211,6 +1630,9 @@
     <w:p>
       <w:pPr>
         <w:pStyle w:val="Heading2"/>
+        <w:keepNext/>
+        <w:keepLines/>
+        <w:widowControl/>
         <w:spacing w:after="140" w:before="320"/>
       </w:pPr>
       <w:r>
@@ -1219,6 +1641,7 @@
     </w:p>
     <w:p>
       <w:pPr>
+        <w:widowControl/>
         <w:spacing w:after="160" w:line="276"/>
       </w:pPr>
       <w:r>
@@ -1232,6 +1655,7 @@
     <w:p>
       <w:pPr>
         <w:pStyle w:val="ListParagraph"/>
+        <w:widowControl/>
         <w:numPr>
           <w:ilvl w:val="0"/>
           <w:numId w:val="2"/>
@@ -1258,6 +1682,7 @@
     <w:p>
       <w:pPr>
         <w:pStyle w:val="ListParagraph"/>
+        <w:widowControl/>
         <w:numPr>
           <w:ilvl w:val="0"/>
           <w:numId w:val="2"/>
@@ -1274,6 +1699,7 @@
     </w:p>
     <w:p>
       <w:pPr>
+        <w:widowControl/>
         <w:spacing w:after="160" w:line="276"/>
       </w:pPr>
       <w:r>
@@ -1286,6 +1712,7 @@
     </w:p>
     <w:p>
       <w:pPr>
+        <w:keepNext/>
         <w:spacing w:after="200" w:before="200"/>
         <w:jc w:val="center"/>
       </w:pPr>
@@ -1332,6 +1759,7 @@
     </w:p>
     <w:p>
       <w:pPr>
+        <w:widowControl/>
         <w:spacing w:after="160" w:line="276"/>
       </w:pPr>
       <w:r>
@@ -1353,6 +1781,7 @@
     </w:p>
     <w:p>
       <w:pPr>
+        <w:widowControl/>
         <w:spacing w:after="160" w:line="276"/>
       </w:pPr>
       <w:r>
@@ -1366,6 +1795,9 @@
     <w:p>
       <w:pPr>
         <w:pStyle w:val="Heading2"/>
+        <w:keepNext/>
+        <w:keepLines/>
+        <w:widowControl/>
         <w:spacing w:after="140" w:before="320"/>
       </w:pPr>
       <w:r>
@@ -1374,6 +1806,7 @@
     </w:p>
     <w:p>
       <w:pPr>
+        <w:widowControl/>
         <w:spacing w:after="160" w:line="276"/>
       </w:pPr>
       <w:r>
@@ -1400,6 +1833,9 @@
         <w:gridCol w:w="9026"/>
       </w:tblGrid>
       <w:tr>
+        <w:trPr>
+          <w:cantSplit/>
+        </w:trPr>
         <w:tc>
           <w:tcPr>
             <w:tcW w:type="dxa" w:w="9026"/>
@@ -1413,6 +1849,7 @@
           </w:tcPr>
           <w:p>
             <w:pPr>
+              <w:widowControl/>
               <w:spacing w:after="0"/>
             </w:pPr>
             <w:r>
@@ -1437,6 +1874,7 @@
     </w:tbl>
     <w:p>
       <w:pPr>
+        <w:widowControl/>
         <w:spacing w:after="160" w:line="276"/>
       </w:pPr>
       <w:r>
@@ -1449,6 +1887,7 @@
     </w:p>
     <w:p>
       <w:pPr>
+        <w:widowControl/>
         <w:spacing w:after="160" w:line="276"/>
       </w:pPr>
       <w:r>
@@ -1462,6 +1901,9 @@
     <w:p>
       <w:pPr>
         <w:pStyle w:val="Heading2"/>
+        <w:keepNext/>
+        <w:keepLines/>
+        <w:widowControl/>
         <w:spacing w:after="140" w:before="320"/>
       </w:pPr>
       <w:r>
@@ -1470,6 +1912,7 @@
     </w:p>
     <w:p>
       <w:pPr>
+        <w:widowControl/>
         <w:spacing w:after="160" w:line="276"/>
       </w:pPr>
       <w:r>
@@ -1514,6 +1957,7 @@
       </w:tblGrid>
       <w:tr>
         <w:trPr>
+          <w:cantSplit/>
           <w:tblHeader/>
         </w:trPr>
         <w:tc>
@@ -1596,6 +2040,9 @@
         </w:tc>
       </w:tr>
       <w:tr>
+        <w:trPr>
+          <w:cantSplit/>
+        </w:trPr>
         <w:tc>
           <w:tcPr>
             <w:tcW w:type="dxa" w:w="1900"/>
@@ -1668,6 +2115,9 @@
         </w:tc>
       </w:tr>
       <w:tr>
+        <w:trPr>
+          <w:cantSplit/>
+        </w:trPr>
         <w:tc>
           <w:tcPr>
             <w:tcW w:type="dxa" w:w="1900"/>
@@ -1740,6 +2190,9 @@
         </w:tc>
       </w:tr>
       <w:tr>
+        <w:trPr>
+          <w:cantSplit/>
+        </w:trPr>
         <w:tc>
           <w:tcPr>
             <w:tcW w:type="dxa" w:w="1900"/>
@@ -1812,6 +2265,9 @@
         </w:tc>
       </w:tr>
       <w:tr>
+        <w:trPr>
+          <w:cantSplit/>
+        </w:trPr>
         <w:tc>
           <w:tcPr>
             <w:tcW w:type="dxa" w:w="1900"/>
@@ -1884,6 +2340,9 @@
         </w:tc>
       </w:tr>
       <w:tr>
+        <w:trPr>
+          <w:cantSplit/>
+        </w:trPr>
         <w:tc>
           <w:tcPr>
             <w:tcW w:type="dxa" w:w="1900"/>
@@ -1956,6 +2415,9 @@
         </w:tc>
       </w:tr>
       <w:tr>
+        <w:trPr>
+          <w:cantSplit/>
+        </w:trPr>
         <w:tc>
           <w:tcPr>
             <w:tcW w:type="dxa" w:w="1900"/>
@@ -2029,6 +2491,9 @@
         </w:tc>
       </w:tr>
       <w:tr>
+        <w:trPr>
+          <w:cantSplit/>
+        </w:trPr>
         <w:tc>
           <w:tcPr>
             <w:tcW w:type="dxa" w:w="1900"/>
@@ -2102,6 +2567,9 @@
         </w:tc>
       </w:tr>
       <w:tr>
+        <w:trPr>
+          <w:cantSplit/>
+        </w:trPr>
         <w:tc>
           <w:tcPr>
             <w:tcW w:type="dxa" w:w="1900"/>
@@ -2176,6 +2644,7 @@
     </w:tbl>
     <w:p>
       <w:pPr>
+        <w:widowControl/>
         <w:spacing w:after="160" w:line="276"/>
       </w:pPr>
       <w:r>
@@ -2188,6 +2657,7 @@
     </w:p>
     <w:p>
       <w:pPr>
+        <w:widowControl/>
         <w:spacing w:after="160" w:line="276"/>
       </w:pPr>
       <w:r>
@@ -2200,6 +2670,7 @@
     </w:p>
     <w:p>
       <w:pPr>
+        <w:widowControl/>
         <w:spacing w:after="160" w:line="276"/>
       </w:pPr>
       <w:r>
@@ -2258,6 +2729,9 @@
     <w:p>
       <w:pPr>
         <w:pStyle w:val="Heading2"/>
+        <w:keepNext/>
+        <w:keepLines/>
+        <w:widowControl/>
         <w:spacing w:after="140" w:before="320"/>
       </w:pPr>
       <w:r>
@@ -2267,6 +2741,7 @@
     <w:p>
       <w:pPr>
         <w:pStyle w:val="ListParagraph"/>
+        <w:widowControl/>
         <w:numPr>
           <w:ilvl w:val="0"/>
           <w:numId w:val="2"/>
@@ -2284,6 +2759,7 @@
     <w:p>
       <w:pPr>
         <w:pStyle w:val="ListParagraph"/>
+        <w:widowControl/>
         <w:numPr>
           <w:ilvl w:val="0"/>
           <w:numId w:val="2"/>
@@ -2301,6 +2777,7 @@
     <w:p>
       <w:pPr>
         <w:pStyle w:val="ListParagraph"/>
+        <w:widowControl/>
         <w:numPr>
           <w:ilvl w:val="0"/>
           <w:numId w:val="2"/>
@@ -2318,6 +2795,7 @@
     <w:p>
       <w:pPr>
         <w:pStyle w:val="ListParagraph"/>
+        <w:widowControl/>
         <w:numPr>
           <w:ilvl w:val="0"/>
           <w:numId w:val="2"/>
@@ -2335,6 +2813,7 @@
     <w:p>
       <w:pPr>
         <w:pStyle w:val="ListParagraph"/>
+        <w:widowControl/>
         <w:numPr>
           <w:ilvl w:val="0"/>
           <w:numId w:val="2"/>
@@ -2350,13 +2829,12 @@
       </w:r>
     </w:p>
     <w:p>
-      <w:r>
-        <w:br w:type="page"/>
-      </w:r>
-    </w:p>
-    <w:p>
       <w:pPr>
         <w:pStyle w:val="Heading1"/>
+        <w:keepNext/>
+        <w:keepLines/>
+        <w:pageBreakBefore/>
+        <w:widowControl/>
         <w:spacing w:after="200" w:before="400"/>
       </w:pPr>
       <w:r>
@@ -2379,6 +2857,9 @@
         <w:gridCol w:w="9026"/>
       </w:tblGrid>
       <w:tr>
+        <w:trPr>
+          <w:cantSplit/>
+        </w:trPr>
         <w:tc>
           <w:tcPr>
             <w:tcW w:type="dxa" w:w="9026"/>
@@ -2392,6 +2873,7 @@
           </w:tcPr>
           <w:p>
             <w:pPr>
+              <w:widowControl/>
               <w:spacing w:after="0"/>
             </w:pPr>
             <w:r>
@@ -2416,6 +2898,7 @@
     </w:tbl>
     <w:p>
       <w:pPr>
+        <w:widowControl/>
         <w:spacing w:after="160" w:line="276"/>
       </w:pPr>
       <w:r>
@@ -2429,6 +2912,9 @@
     <w:p>
       <w:pPr>
         <w:pStyle w:val="Heading2"/>
+        <w:keepNext/>
+        <w:keepLines/>
+        <w:widowControl/>
         <w:spacing w:after="140" w:before="320"/>
       </w:pPr>
       <w:r>
@@ -2437,6 +2923,7 @@
     </w:p>
     <w:p>
       <w:pPr>
+        <w:widowControl/>
         <w:spacing w:after="160" w:line="276"/>
       </w:pPr>
       <w:r>
@@ -2450,6 +2937,9 @@
     <w:p>
       <w:pPr>
         <w:pStyle w:val="Heading2"/>
+        <w:keepNext/>
+        <w:keepLines/>
+        <w:widowControl/>
         <w:spacing w:after="140" w:before="320"/>
       </w:pPr>
       <w:r>
@@ -2475,6 +2965,7 @@
       </w:tblGrid>
       <w:tr>
         <w:trPr>
+          <w:cantSplit/>
           <w:tblHeader/>
         </w:trPr>
         <w:tc>
@@ -2557,6 +3048,9 @@
         </w:tc>
       </w:tr>
       <w:tr>
+        <w:trPr>
+          <w:cantSplit/>
+        </w:trPr>
         <w:tc>
           <w:tcPr>
             <w:tcW w:type="dxa" w:w="2200"/>
@@ -2628,6 +3122,9 @@
         </w:tc>
       </w:tr>
       <w:tr>
+        <w:trPr>
+          <w:cantSplit/>
+        </w:trPr>
         <w:tc>
           <w:tcPr>
             <w:tcW w:type="dxa" w:w="2200"/>
@@ -2699,6 +3196,9 @@
         </w:tc>
       </w:tr>
       <w:tr>
+        <w:trPr>
+          <w:cantSplit/>
+        </w:trPr>
         <w:tc>
           <w:tcPr>
             <w:tcW w:type="dxa" w:w="2200"/>
@@ -2770,6 +3270,9 @@
         </w:tc>
       </w:tr>
       <w:tr>
+        <w:trPr>
+          <w:cantSplit/>
+        </w:trPr>
         <w:tc>
           <w:tcPr>
             <w:tcW w:type="dxa" w:w="2200"/>
@@ -2843,6 +3346,7 @@
     </w:tbl>
     <w:p>
       <w:pPr>
+        <w:widowControl/>
         <w:spacing w:after="160" w:line="276"/>
       </w:pPr>
       <w:r>
@@ -2855,6 +3359,7 @@
     </w:p>
     <w:p>
       <w:pPr>
+        <w:widowControl/>
         <w:spacing w:after="160" w:line="276"/>
       </w:pPr>
       <w:r>
@@ -2868,6 +3373,9 @@
     <w:p>
       <w:pPr>
         <w:pStyle w:val="Heading2"/>
+        <w:keepNext/>
+        <w:keepLines/>
+        <w:widowControl/>
         <w:spacing w:after="140" w:before="320"/>
       </w:pPr>
       <w:r>
@@ -2876,6 +3384,7 @@
     </w:p>
     <w:p>
       <w:pPr>
+        <w:widowControl/>
         <w:spacing w:after="160" w:line="276"/>
       </w:pPr>
       <w:r>
@@ -2889,6 +3398,7 @@
     <w:p>
       <w:pPr>
         <w:pStyle w:val="ListParagraph"/>
+        <w:widowControl/>
         <w:numPr>
           <w:ilvl w:val="0"/>
           <w:numId w:val="2"/>
@@ -2915,6 +3425,7 @@
     <w:p>
       <w:pPr>
         <w:pStyle w:val="ListParagraph"/>
+        <w:widowControl/>
         <w:numPr>
           <w:ilvl w:val="0"/>
           <w:numId w:val="2"/>
@@ -2941,6 +3452,7 @@
     <w:p>
       <w:pPr>
         <w:pStyle w:val="ListParagraph"/>
+        <w:widowControl/>
         <w:numPr>
           <w:ilvl w:val="0"/>
           <w:numId w:val="2"/>
@@ -2966,6 +3478,7 @@
     </w:p>
     <w:p>
       <w:pPr>
+        <w:widowControl/>
         <w:spacing w:after="160" w:line="276"/>
       </w:pPr>
       <w:r>
@@ -2979,6 +3492,9 @@
     <w:p>
       <w:pPr>
         <w:pStyle w:val="Heading2"/>
+        <w:keepNext/>
+        <w:keepLines/>
+        <w:widowControl/>
         <w:spacing w:after="140" w:before="320"/>
       </w:pPr>
       <w:r>
@@ -2987,6 +3503,7 @@
     </w:p>
     <w:p>
       <w:pPr>
+        <w:widowControl/>
         <w:spacing w:after="160" w:line="276"/>
       </w:pPr>
       <w:r>
@@ -2999,6 +3516,7 @@
     </w:p>
     <w:p>
       <w:pPr>
+        <w:widowControl/>
         <w:spacing w:after="160" w:line="276"/>
       </w:pPr>
       <w:r>
@@ -3012,6 +3530,9 @@
     <w:p>
       <w:pPr>
         <w:pStyle w:val="Heading2"/>
+        <w:keepNext/>
+        <w:keepLines/>
+        <w:widowControl/>
         <w:spacing w:after="140" w:before="320"/>
       </w:pPr>
       <w:r>
@@ -3020,6 +3541,7 @@
     </w:p>
     <w:p>
       <w:pPr>
+        <w:widowControl/>
         <w:spacing w:after="160" w:line="276"/>
       </w:pPr>
       <w:r>
@@ -3032,6 +3554,7 @@
     </w:p>
     <w:p>
       <w:pPr>
+        <w:widowControl/>
         <w:spacing w:after="160" w:line="276"/>
       </w:pPr>
       <w:r>
@@ -3045,6 +3568,9 @@
     <w:p>
       <w:pPr>
         <w:pStyle w:val="Heading2"/>
+        <w:keepNext/>
+        <w:keepLines/>
+        <w:widowControl/>
         <w:spacing w:after="140" w:before="320"/>
       </w:pPr>
       <w:r>
@@ -3054,6 +3580,7 @@
     <w:p>
       <w:pPr>
         <w:pStyle w:val="ListParagraph"/>
+        <w:widowControl/>
         <w:numPr>
           <w:ilvl w:val="0"/>
           <w:numId w:val="2"/>
@@ -3071,6 +3598,7 @@
     <w:p>
       <w:pPr>
         <w:pStyle w:val="ListParagraph"/>
+        <w:widowControl/>
         <w:numPr>
           <w:ilvl w:val="0"/>
           <w:numId w:val="2"/>
@@ -3088,6 +3616,7 @@
     <w:p>
       <w:pPr>
         <w:pStyle w:val="ListParagraph"/>
+        <w:widowControl/>
         <w:numPr>
           <w:ilvl w:val="0"/>
           <w:numId w:val="2"/>
@@ -3105,6 +3634,7 @@
     <w:p>
       <w:pPr>
         <w:pStyle w:val="ListParagraph"/>
+        <w:widowControl/>
         <w:numPr>
           <w:ilvl w:val="0"/>
           <w:numId w:val="2"/>
@@ -3122,6 +3652,7 @@
     <w:p>
       <w:pPr>
         <w:pStyle w:val="ListParagraph"/>
+        <w:widowControl/>
         <w:numPr>
           <w:ilvl w:val="0"/>
           <w:numId w:val="2"/>
@@ -3139,6 +3670,9 @@
     <w:p>
       <w:pPr>
         <w:pStyle w:val="Heading2"/>
+        <w:keepNext/>
+        <w:keepLines/>
+        <w:widowControl/>
         <w:spacing w:after="140" w:before="320"/>
       </w:pPr>
       <w:r>
@@ -3147,6 +3681,7 @@
     </w:p>
     <w:p>
       <w:pPr>
+        <w:widowControl/>
         <w:spacing w:after="160" w:line="276"/>
       </w:pPr>
       <w:r>
@@ -3175,6 +3710,7 @@
       </w:tblGrid>
       <w:tr>
         <w:trPr>
+          <w:cantSplit/>
           <w:tblHeader/>
         </w:trPr>
         <w:tc>
@@ -3231,6 +3767,9 @@
         </w:tc>
       </w:tr>
       <w:tr>
+        <w:trPr>
+          <w:cantSplit/>
+        </w:trPr>
         <w:tc>
           <w:tcPr>
             <w:tcW w:type="dxa" w:w="2400"/>
@@ -3279,6 +3818,9 @@
         </w:tc>
       </w:tr>
       <w:tr>
+        <w:trPr>
+          <w:cantSplit/>
+        </w:trPr>
         <w:tc>
           <w:tcPr>
             <w:tcW w:type="dxa" w:w="2400"/>
@@ -3327,6 +3869,9 @@
         </w:tc>
       </w:tr>
       <w:tr>
+        <w:trPr>
+          <w:cantSplit/>
+        </w:trPr>
         <w:tc>
           <w:tcPr>
             <w:tcW w:type="dxa" w:w="2400"/>
@@ -3375,6 +3920,9 @@
         </w:tc>
       </w:tr>
       <w:tr>
+        <w:trPr>
+          <w:cantSplit/>
+        </w:trPr>
         <w:tc>
           <w:tcPr>
             <w:tcW w:type="dxa" w:w="2400"/>
@@ -3423,6 +3971,9 @@
         </w:tc>
       </w:tr>
       <w:tr>
+        <w:trPr>
+          <w:cantSplit/>
+        </w:trPr>
         <w:tc>
           <w:tcPr>
             <w:tcW w:type="dxa" w:w="2400"/>
@@ -3472,13 +4023,12 @@
       </w:tr>
     </w:tbl>
     <w:p>
-      <w:r>
-        <w:br w:type="page"/>
-      </w:r>
-    </w:p>
-    <w:p>
       <w:pPr>
         <w:pStyle w:val="Heading1"/>
+        <w:keepNext/>
+        <w:keepLines/>
+        <w:pageBreakBefore/>
+        <w:widowControl/>
         <w:spacing w:after="200" w:before="400"/>
       </w:pPr>
       <w:r>
@@ -3487,6 +4037,7 @@
     </w:p>
     <w:p>
       <w:pPr>
+        <w:widowControl/>
         <w:spacing w:after="160" w:line="276"/>
       </w:pPr>
       <w:r>
@@ -3515,6 +4066,7 @@
       </w:tblGrid>
       <w:tr>
         <w:trPr>
+          <w:cantSplit/>
           <w:tblHeader/>
         </w:trPr>
         <w:tc>
@@ -3571,6 +4123,9 @@
         </w:tc>
       </w:tr>
       <w:tr>
+        <w:trPr>
+          <w:cantSplit/>
+        </w:trPr>
         <w:tc>
           <w:tcPr>
             <w:tcW w:type="dxa" w:w="2600"/>
@@ -3619,6 +4174,9 @@
         </w:tc>
       </w:tr>
       <w:tr>
+        <w:trPr>
+          <w:cantSplit/>
+        </w:trPr>
         <w:tc>
           <w:tcPr>
             <w:tcW w:type="dxa" w:w="2600"/>
@@ -3667,6 +4225,9 @@
         </w:tc>
       </w:tr>
       <w:tr>
+        <w:trPr>
+          <w:cantSplit/>
+        </w:trPr>
         <w:tc>
           <w:tcPr>
             <w:tcW w:type="dxa" w:w="2600"/>
@@ -3715,6 +4276,9 @@
         </w:tc>
       </w:tr>
       <w:tr>
+        <w:trPr>
+          <w:cantSplit/>
+        </w:trPr>
         <w:tc>
           <w:tcPr>
             <w:tcW w:type="dxa" w:w="2600"/>
@@ -3763,6 +4327,9 @@
         </w:tc>
       </w:tr>
       <w:tr>
+        <w:trPr>
+          <w:cantSplit/>
+        </w:trPr>
         <w:tc>
           <w:tcPr>
             <w:tcW w:type="dxa" w:w="2600"/>
@@ -3811,6 +4378,9 @@
         </w:tc>
       </w:tr>
       <w:tr>
+        <w:trPr>
+          <w:cantSplit/>
+        </w:trPr>
         <w:tc>
           <w:tcPr>
             <w:tcW w:type="dxa" w:w="2600"/>
@@ -3859,6 +4429,9 @@
         </w:tc>
       </w:tr>
       <w:tr>
+        <w:trPr>
+          <w:cantSplit/>
+        </w:trPr>
         <w:tc>
           <w:tcPr>
             <w:tcW w:type="dxa" w:w="2600"/>
@@ -3909,6 +4482,7 @@
     </w:tbl>
     <w:p>
       <w:pPr>
+        <w:widowControl/>
         <w:spacing w:after="160" w:line="276"/>
       </w:pPr>
       <w:r>
@@ -3921,6 +4495,7 @@
     </w:p>
     <w:p>
       <w:pPr>
+        <w:widowControl/>
         <w:spacing w:after="160" w:line="276"/>
       </w:pPr>
       <w:r>
@@ -3948,6 +4523,7 @@
     </w:p>
     <w:p>
       <w:pPr>
+        <w:widowControl/>
         <w:spacing w:after="160" w:line="276"/>
       </w:pPr>
       <w:r>
@@ -3961,6 +4537,10 @@
     <w:p>
       <w:pPr>
         <w:pStyle w:val="Heading1"/>
+        <w:keepNext/>
+        <w:keepLines/>
+        <w:pageBreakBefore/>
+        <w:widowControl/>
         <w:spacing w:after="200" w:before="400"/>
       </w:pPr>
       <w:r>
@@ -3969,6 +4549,7 @@
     </w:p>
     <w:p>
       <w:pPr>
+        <w:widowControl/>
         <w:spacing w:after="160" w:line="276"/>
       </w:pPr>
       <w:r>
@@ -3982,6 +4563,7 @@
     <w:p>
       <w:pPr>
         <w:pStyle w:val="ListParagraph"/>
+        <w:widowControl/>
         <w:numPr>
           <w:ilvl w:val="0"/>
           <w:numId w:val="2"/>
@@ -4008,6 +4590,7 @@
     <w:p>
       <w:pPr>
         <w:pStyle w:val="ListParagraph"/>
+        <w:widowControl/>
         <w:numPr>
           <w:ilvl w:val="0"/>
           <w:numId w:val="2"/>
@@ -4034,6 +4617,7 @@
     <w:p>
       <w:pPr>
         <w:pStyle w:val="ListParagraph"/>
+        <w:widowControl/>
         <w:numPr>
           <w:ilvl w:val="0"/>
           <w:numId w:val="2"/>
@@ -4060,6 +4644,7 @@
     <w:p>
       <w:pPr>
         <w:pStyle w:val="ListParagraph"/>
+        <w:widowControl/>
         <w:numPr>
           <w:ilvl w:val="0"/>
           <w:numId w:val="2"/>

</xml_diff>

<commit_message>
Capa do manual ganha o ícone do app, centralizada, e crédito de autoria
Ícone reaproveitado de public/icone-512.png (gerar_icone.py) no topo,
com o resto da capa recentralizado por baixo — hierarquia de capa de
manual da Apple, em vez do bloco alinhado à esquerda de antes.

Co-Authored-By: Claude Sonnet 5 <noreply@anthropic.com>
</commit_message>
<xml_diff>
--- a/docs/Adsum-manual-e-LGPD.docx
+++ b/docs/Adsum-manual-e-LGPD.docx
@@ -4,14 +4,61 @@
   <w:body>
     <w:p>
       <w:pPr>
-        <w:spacing w:after="0" w:before="2600"/>
+        <w:spacing w:after="320" w:before="1500"/>
+        <w:jc w:val="center"/>
+      </w:pPr>
+      <w:r>
+        <w:drawing>
+          <wp:inline distT="0" distB="0" distL="0" distR="0">
+            <wp:extent cx="1028700" cy="1028700"/>
+            <wp:effectExtent t="0" r="0" b="0" l="0"/>
+            <wp:docPr id="1" name="" descr="" title=""/>
+            <wp:cNvGraphicFramePr>
+              <a:graphicFrameLocks xmlns:a="http://schemas.openxmlformats.org/drawingml/2006/main" noChangeAspect="1"/>
+            </wp:cNvGraphicFramePr>
+            <a:graphic xmlns:a="http://schemas.openxmlformats.org/drawingml/2006/main">
+              <a:graphicData uri="http://schemas.openxmlformats.org/drawingml/2006/picture">
+                <pic:pic xmlns:pic="http://schemas.openxmlformats.org/drawingml/2006/picture">
+                  <pic:nvPicPr>
+                    <pic:cNvPr id="0" name="" descr=""/>
+                    <pic:cNvPicPr>
+                      <a:picLocks noChangeAspect="1" noChangeArrowheads="1"/>
+                    </pic:cNvPicPr>
+                  </pic:nvPicPr>
+                  <pic:blipFill>
+                    <a:blip r:embed="rId7" cstate="none"/>
+                    <a:srcRect/>
+                    <a:stretch>
+                      <a:fillRect/>
+                    </a:stretch>
+                  </pic:blipFill>
+                  <pic:spPr bwMode="auto">
+                    <a:xfrm>
+                      <a:off x="0" y="0"/>
+                      <a:ext cx="1028700" cy="1028700"/>
+                    </a:xfrm>
+                    <a:prstGeom prst="rect">
+                      <a:avLst/>
+                    </a:prstGeom>
+                  </pic:spPr>
+                </pic:pic>
+              </a:graphicData>
+            </a:graphic>
+          </wp:inline>
+        </w:drawing>
+      </w:r>
+    </w:p>
+    <w:p>
+      <w:pPr>
+        <w:spacing w:after="80"/>
+        <w:jc w:val="center"/>
       </w:pPr>
       <w:r>
         <w:rPr>
           <w:b/>
           <w:bCs/>
-          <w:sz w:val="72"/>
-          <w:szCs w:val="72"/>
+          <w:sz w:val="60"/>
+          <w:szCs w:val="60"/>
         </w:rPr>
         <w:t xml:space="preserve">Adsum</w:t>
       </w:r>
@@ -19,12 +66,13 @@
     <w:p>
       <w:pPr>
         <w:spacing w:after="600"/>
+        <w:jc w:val="center"/>
       </w:pPr>
       <w:r>
         <w:rPr>
           <w:color w:val="6E6E73"/>
-          <w:sz w:val="30"/>
-          <w:szCs w:val="30"/>
+          <w:sz w:val="28"/>
+          <w:szCs w:val="28"/>
         </w:rPr>
         <w:t xml:space="preserve">Registro de frequência por crachá</w:t>
       </w:r>
@@ -32,6 +80,7 @@
     <w:p>
       <w:pPr>
         <w:spacing w:after="120"/>
+        <w:jc w:val="center"/>
       </w:pPr>
       <w:r>
         <w:rPr>
@@ -43,7 +92,8 @@
     </w:p>
     <w:p>
       <w:pPr>
-        <w:spacing w:after="600"/>
+        <w:spacing w:after="120"/>
+        <w:jc w:val="center"/>
       </w:pPr>
       <w:r>
         <w:rPr>
@@ -52,6 +102,20 @@
           <w:szCs w:val="22"/>
         </w:rPr>
         <w:t xml:space="preserve">Centro de Informática — UFPE</w:t>
+      </w:r>
+    </w:p>
+    <w:p>
+      <w:pPr>
+        <w:spacing w:after="700"/>
+        <w:jc w:val="center"/>
+      </w:pPr>
+      <w:r>
+        <w:rPr>
+          <w:color w:val="6E6E73"/>
+          <w:sz w:val="20"/>
+          <w:szCs w:val="20"/>
+        </w:rPr>
+        <w:t xml:space="preserve">Willian Neves Rupert Jones</w:t>
       </w:r>
     </w:p>
     <w:tbl>
@@ -1735,7 +1799,7 @@
                     </pic:cNvPicPr>
                   </pic:nvPicPr>
                   <pic:blipFill>
-                    <a:blip r:embed="rId7" cstate="none"/>
+                    <a:blip r:embed="rId8" cstate="none"/>
                     <a:srcRect/>
                     <a:stretch>
                       <a:fillRect/>

</xml_diff>

<commit_message>
Número de evento reservado, não contado, e o manual atualizado
- Config.proximaSequencia: contador que só anda para frente, reservado em
  transação. Colisão de evento_id deixa de ser possível em vez de ser
  recuperada; a tentativa fica como rede para log trazido de fora.
- EnsaioDeQuinta.test.tsx: a aula de quinta inteira sobre a base do
  professor — turma já cadastrada encosta, quem falta entra pela busca.
- Manual de LGPD: seção 4.5 descreve o diário e o arquivo de códigos dos
  crachás, com o risco dito e como desligar; corrige as três afirmações de
  que o número do crachá nunca é guardado.

Co-Authored-By: Claude Opus 5 <noreply@anthropic.com>
</commit_message>
<xml_diff>
--- a/docs/Adsum-manual-e-LGPD.docx
+++ b/docs/Adsum-manual-e-LGPD.docx
@@ -420,6 +420,20 @@
         </w:p>
         <w:p>
           <w:pPr>
+            <w:pStyle w:val="TOC2"/>
+            <w:tabs>
+              <w:tab w:val="clear" w:pos="8786"/>
+              <w:tab w:val="right" w:pos="9025" w:leader="dot"/>
+            </w:tabs>
+          </w:pPr>
+          <w:r>
+            <w:t xml:space="default">4.5 Os dois arquivos que a pasta ganhou em 22/09/2026</w:t>
+            <w:tab/>
+            <w:t xml:space="default"/>
+          </w:r>
+        </w:p>
+        <w:p>
+          <w:pPr>
             <w:pStyle w:val="TOC1"/>
             <w:tabs>
               <w:tab w:val="clear" w:pos="9026"/>
@@ -2853,7 +2867,7 @@
           <w:sz w:val="22"/>
           <w:szCs w:val="22"/>
         </w:rPr>
-        <w:t xml:space="preserve">Não guarda o número do crachá, o login do SIGAA, e-mail ou foto.</w:t>
+        <w:t xml:space="preserve">Não guarda o login do SIGAA, e-mail ou foto.</w:t>
       </w:r>
     </w:p>
     <w:p>
@@ -2871,7 +2885,23 @@
           <w:sz w:val="22"/>
           <w:szCs w:val="22"/>
         </w:rPr>
-        <w:t xml:space="preserve">Não tem administrador, e não existe visão central: cada professor tem a sua base, no seu computador.</w:t>
+        <w:t xml:space="preserve">Não guarda o número do crachá, </w:t>
+      </w:r>
+      <w:r>
+        <w:rPr>
+          <w:b/>
+          <w:bCs/>
+          <w:sz w:val="22"/>
+          <w:szCs w:val="22"/>
+        </w:rPr>
+        <w:t xml:space="preserve">com uma exceção que o professor liga e desliga</w:t>
+      </w:r>
+      <w:r>
+        <w:rPr>
+          <w:sz w:val="22"/>
+          <w:szCs w:val="22"/>
+        </w:rPr>
+        <w:t xml:space="preserve"> — ver a seção 4.5.</w:t>
       </w:r>
     </w:p>
     <w:p>
@@ -2889,7 +2919,163 @@
           <w:sz w:val="22"/>
           <w:szCs w:val="22"/>
         </w:rPr>
+        <w:t xml:space="preserve">Não tem administrador, e não existe visão central: cada professor tem a sua base, no seu computador.</w:t>
+      </w:r>
+    </w:p>
+    <w:p>
+      <w:pPr>
+        <w:pStyle w:val="ListParagraph"/>
+        <w:widowControl/>
+        <w:numPr>
+          <w:ilvl w:val="0"/>
+          <w:numId w:val="2"/>
+        </w:numPr>
+        <w:spacing w:after="100" w:line="276"/>
+      </w:pPr>
+      <w:r>
+        <w:rPr>
+          <w:sz w:val="22"/>
+          <w:szCs w:val="22"/>
+        </w:rPr>
         <w:t xml:space="preserve">Não apaga nem reescreve registro de presença — nem o próprio programa consegue, porque a operação não existe no código.</w:t>
+      </w:r>
+    </w:p>
+    <w:p>
+      <w:pPr>
+        <w:pStyle w:val="Heading2"/>
+        <w:keepNext/>
+        <w:keepLines/>
+        <w:widowControl/>
+        <w:spacing w:after="140" w:before="320"/>
+      </w:pPr>
+      <w:r>
+        <w:t xml:space="preserve">4.5 Os dois arquivos que a pasta ganhou em 22/09/2026</w:t>
+      </w:r>
+    </w:p>
+    <w:p>
+      <w:pPr>
+        <w:widowControl/>
+        <w:spacing w:after="160" w:line="276"/>
+      </w:pPr>
+      <w:r>
+        <w:rPr>
+          <w:sz w:val="22"/>
+          <w:szCs w:val="22"/>
+        </w:rPr>
+        <w:t xml:space="preserve">Uma aula real falhou: metade da turma apareceu como crachá desconhecido, e no meio da chamada as presenças deixaram de ser contadas. As causas foram achadas e corrigidas, e duas coisas novas passaram a ser gravadas na pasta por causa disso.</w:t>
+      </w:r>
+    </w:p>
+    <w:p>
+      <w:pPr>
+        <w:widowControl/>
+        <w:spacing w:after="160" w:line="276"/>
+      </w:pPr>
+      <w:r>
+        <w:rPr>
+          <w:sz w:val="22"/>
+          <w:szCs w:val="22"/>
+        </w:rPr>
+        <w:t xml:space="preserve">A primeira é o diário: </w:t>
+      </w:r>
+      <w:r>
+        <w:rPr>
+          <w:rFonts w:ascii="Courier New" w:cs="Courier New" w:eastAsia="Courier New" w:hAnsi="Courier New"/>
+          <w:sz w:val="20"/>
+          <w:szCs w:val="20"/>
+        </w:rPr>
+        <w:t xml:space="preserve">diagnostico/&lt;dia&gt;.log</w:t>
+      </w:r>
+      <w:r>
+        <w:rPr>
+          <w:sz w:val="22"/>
+          <w:szCs w:val="22"/>
+        </w:rPr>
+        <w:t xml:space="preserve">. Uma linha por leitura, decisão, gravação e erro, com a hora e o tempo que cada etapa levou. Ele não guarda nome nem número de crachá: cada crachá aparece pelos oito primeiros caracteres do resumo, o bastante para seguir a mesma pessoa dentro do dia e nada mais. Serve para que uma aula que dá errado possa ser entendida depois, em vez de virar suposição.</w:t>
+      </w:r>
+    </w:p>
+    <w:p>
+      <w:pPr>
+        <w:widowControl/>
+        <w:spacing w:after="160" w:line="276"/>
+      </w:pPr>
+      <w:r>
+        <w:rPr>
+          <w:sz w:val="22"/>
+          <w:szCs w:val="22"/>
+        </w:rPr>
+        <w:t xml:space="preserve">A segunda é a auditoria de crachás: </w:t>
+      </w:r>
+      <w:r>
+        <w:rPr>
+          <w:rFonts w:ascii="Courier New" w:cs="Courier New" w:eastAsia="Courier New" w:hAnsi="Courier New"/>
+          <w:sz w:val="20"/>
+          <w:szCs w:val="20"/>
+        </w:rPr>
+        <w:t xml:space="preserve">auditoria/uids.csv</w:t>
+      </w:r>
+      <w:r>
+        <w:rPr>
+          <w:sz w:val="22"/>
+          <w:szCs w:val="22"/>
+        </w:rPr>
+        <w:t xml:space="preserve">. </w:t>
+      </w:r>
+      <w:r>
+        <w:rPr>
+          <w:b/>
+          <w:bCs/>
+          <w:sz w:val="22"/>
+          <w:szCs w:val="22"/>
+        </w:rPr>
+        <w:t xml:space="preserve">Este arquivo guarda o número de série do crachá</w:t>
+      </w:r>
+      <w:r>
+        <w:rPr>
+          <w:sz w:val="22"/>
+          <w:szCs w:val="22"/>
+        </w:rPr>
+        <w:t xml:space="preserve">, ao lado do resumo dele, uma linha por crachá, na primeira vez que é lido. É a exceção à regra do resto do documento, e existe por um motivo prático: quando o segredo da instalação se perde, os crachás cadastrados deixam de ser reconhecidos e a turma inteira precisa se recadastrar. Com este arquivo, o vínculo é refeito sem incomodar ninguém.</w:t>
+      </w:r>
+    </w:p>
+    <w:p>
+      <w:pPr>
+        <w:widowControl/>
+        <w:spacing w:after="160" w:line="276"/>
+      </w:pPr>
+      <w:r>
+        <w:rPr>
+          <w:sz w:val="22"/>
+          <w:szCs w:val="22"/>
+        </w:rPr>
+        <w:t xml:space="preserve">O que isso custa, dito sem rodeio: quem tiver este arquivo consegue copiar um crachá. Ele não tem nome nem matrícula — o nome só aparece cruzando com </w:t>
+      </w:r>
+      <w:r>
+        <w:rPr>
+          <w:rFonts w:ascii="Courier New" w:cs="Courier New" w:eastAsia="Courier New" w:hAnsi="Courier New"/>
+          <w:sz w:val="20"/>
+          <w:szCs w:val="20"/>
+        </w:rPr>
+        <w:t xml:space="preserve">vinculos.json</w:t>
+      </w:r>
+      <w:r>
+        <w:rPr>
+          <w:sz w:val="22"/>
+          <w:szCs w:val="22"/>
+        </w:rPr>
+        <w:t xml:space="preserve"> —, mas quem tem a pasta tem os dois. Por isso: o arquivo é separado dos registros de presença, apagá-lo não afeta a chamada, e ele pode ser desligado a qualquer momento em Ajustes → Diagnóstico → "Códigos dos crachás", onde o programa avisa enquanto estiver ligado.</w:t>
+      </w:r>
+    </w:p>
+    <w:p>
+      <w:pPr>
+        <w:widowControl/>
+        <w:spacing w:after="160" w:line="276"/>
+      </w:pPr>
+      <w:r>
+        <w:rPr>
+          <w:sz w:val="22"/>
+          <w:szCs w:val="22"/>
+        </w:rPr>
+        <w:t xml:space="preserve">Ele nasce ligado nesta fase de testes, que é uma escolha deliberada do autor enquanto o programa ainda está sendo posto à prova em sala. Quando essa fase terminar, a decisão deve ser revista, e o padrão deve voltar a ser não guardar.</w:t>
       </w:r>
     </w:p>
     <w:p>
@@ -3231,7 +3417,7 @@
                 <w:sz w:val="20"/>
                 <w:szCs w:val="20"/>
               </w:rPr>
-              <w:t xml:space="preserve">Resumo criptográfico do número de série (8 bytes)</w:t>
+              <w:t xml:space="preserve">Resumo criptográfico do número de série (8 bytes) e, enquanto a auditoria estiver ligada, o próprio número de série (seção 4.5)</w:t>
             </w:r>
           </w:p>
         </w:tc>
@@ -3282,7 +3468,7 @@
                 <w:sz w:val="20"/>
                 <w:szCs w:val="20"/>
               </w:rPr>
-              <w:t xml:space="preserve">Registro de presença</w:t>
+              <w:t xml:space="preserve">Diagnóstico</w:t>
             </w:r>
           </w:p>
         </w:tc>
@@ -3305,7 +3491,7 @@
                 <w:sz w:val="20"/>
                 <w:szCs w:val="20"/>
               </w:rPr>
-              <w:t xml:space="preserve">Data, hora, turma, resultado da leitura</w:t>
+              <w:t xml:space="preserve">Hora de cada leitura, decisão, tempo de gravação e erros, com o crachá identificado por oito caracteres do resumo</w:t>
             </w:r>
           </w:p>
         </w:tc>
@@ -3328,7 +3514,7 @@
                 <w:sz w:val="20"/>
                 <w:szCs w:val="20"/>
               </w:rPr>
-              <w:t xml:space="preserve">Gerado pelo programa</w:t>
+              <w:t xml:space="preserve">Gerado pelo programa (seção 4.5)</w:t>
             </w:r>
           </w:p>
         </w:tc>
@@ -3356,6 +3542,80 @@
                 <w:sz w:val="20"/>
                 <w:szCs w:val="20"/>
               </w:rPr>
+              <w:t xml:space="preserve">Registro de presença</w:t>
+            </w:r>
+          </w:p>
+        </w:tc>
+        <w:tc>
+          <w:tcPr>
+            <w:tcW w:type="dxa" w:w="3600"/>
+            <w:tcMar>
+              <w:top w:type="dxa" w:w="120"/>
+              <w:left w:type="dxa" w:w="160"/>
+              <w:bottom w:type="dxa" w:w="120"/>
+              <w:right w:type="dxa" w:w="160"/>
+            </w:tcMar>
+          </w:tcPr>
+          <w:p>
+            <w:pPr>
+              <w:spacing w:after="0" w:line="260"/>
+            </w:pPr>
+            <w:r>
+              <w:rPr>
+                <w:sz w:val="20"/>
+                <w:szCs w:val="20"/>
+              </w:rPr>
+              <w:t xml:space="preserve">Data, hora, turma, resultado da leitura</w:t>
+            </w:r>
+          </w:p>
+        </w:tc>
+        <w:tc>
+          <w:tcPr>
+            <w:tcW w:type="dxa" w:w="3226"/>
+            <w:tcMar>
+              <w:top w:type="dxa" w:w="120"/>
+              <w:left w:type="dxa" w:w="160"/>
+              <w:bottom w:type="dxa" w:w="120"/>
+              <w:right w:type="dxa" w:w="160"/>
+            </w:tcMar>
+          </w:tcPr>
+          <w:p>
+            <w:pPr>
+              <w:spacing w:after="0" w:line="260"/>
+            </w:pPr>
+            <w:r>
+              <w:rPr>
+                <w:sz w:val="20"/>
+                <w:szCs w:val="20"/>
+              </w:rPr>
+              <w:t xml:space="preserve">Gerado pelo programa</w:t>
+            </w:r>
+          </w:p>
+        </w:tc>
+      </w:tr>
+      <w:tr>
+        <w:trPr>
+          <w:cantSplit/>
+        </w:trPr>
+        <w:tc>
+          <w:tcPr>
+            <w:tcW w:type="dxa" w:w="2200"/>
+            <w:tcMar>
+              <w:top w:type="dxa" w:w="120"/>
+              <w:left w:type="dxa" w:w="160"/>
+              <w:bottom w:type="dxa" w:w="120"/>
+              <w:right w:type="dxa" w:w="160"/>
+            </w:tcMar>
+          </w:tcPr>
+          <w:p>
+            <w:pPr>
+              <w:spacing w:after="0" w:line="260"/>
+            </w:pPr>
+            <w:r>
+              <w:rPr>
+                <w:sz w:val="20"/>
+                <w:szCs w:val="20"/>
+              </w:rPr>
               <w:t xml:space="preserve">Dados do professor</w:t>
             </w:r>
           </w:p>
@@ -3431,7 +3691,20 @@
           <w:sz w:val="22"/>
           <w:szCs w:val="22"/>
         </w:rPr>
-        <w:t xml:space="preserve">Não são tratados: número do crachá, login de acesso, e-mail, telefone, endereço, imagem, dados biométricos, geolocalização, nem qualquer categoria de dado sensível na acepção do art. 5º, II da Lei 13.709/2018.</w:t>
+        <w:t xml:space="preserve">Não são tratados: login de acesso, e-mail, telefone, endereço, imagem, dados biométricos, geolocalização, nem qualquer categoria de dado sensível na acepção do art. 5º, II da Lei 13.709/2018.</w:t>
+      </w:r>
+    </w:p>
+    <w:p>
+      <w:pPr>
+        <w:widowControl/>
+        <w:spacing w:after="160" w:line="276"/>
+      </w:pPr>
+      <w:r>
+        <w:rPr>
+          <w:sz w:val="22"/>
+          <w:szCs w:val="22"/>
+        </w:rPr>
+        <w:t xml:space="preserve">O número do crachá é tratado apenas enquanto a auditoria da seção 4.5 estiver ligada, e fica só na pasta do professor. Desligada, ele volta a não ser guardado em momento algum.</w:t>
       </w:r>
     </w:p>
     <w:p>
@@ -3656,7 +3929,14 @@
           <w:sz w:val="22"/>
           <w:szCs w:val="22"/>
         </w:rPr>
-        <w:t xml:space="preserve">O número do crachá não é armazenado em momento algum — apenas seu resumo com sal, do qual não se volta.</w:t>
+        <w:t xml:space="preserve">O número do crachá não é armazenado — apenas seu resumo com sal, do qual não se volta. </w:t>
+      </w:r>
+      <w:r>
+        <w:rPr>
+          <w:sz w:val="22"/>
+          <w:szCs w:val="22"/>
+        </w:rPr>
+        <w:t xml:space="preserve">A exceção é a auditoria da seção 4.5, que o professor liga e desliga, e cujo arquivo fica na pasta dele.</w:t>
       </w:r>
     </w:p>
     <w:p>
@@ -3674,7 +3954,7 @@
           <w:sz w:val="22"/>
           <w:szCs w:val="22"/>
         </w:rPr>
-        <w:t xml:space="preserve">O sal é sorteado por instalação, não é exibido nem exportável pela interface, e sem ele os resumos são inúteis para reidentificar um crachá.</w:t>
+        <w:t xml:space="preserve">O sal é sorteado por instalação e não aparece na interface. Desde 22/09/2026 nenhum sal é descartado: quando ele muda, o anterior fica guardado, senão os crachás cadastrados nele deixam de ser reconhecidos — foi o que aconteceu numa aula, com quarenta alunos.</w:t>
       </w:r>
     </w:p>
     <w:p>

</xml_diff>

<commit_message>
Manual: o leitor, o aluno de outra turma, lançar no SIGAA, e como o Adsum é testado
Atualizado com o que mudou na branch: o leitor USB de 13,56 MHz, o aviso do
aluno de outra turma e o resultado outra_turma, a pasta sigaa/, a segunda
janela, lançar no SIGAA (em teste), os créditos na capa. Capítulo novo, 8:
o comando único, os testes de unidade e de mutação, a bancada do SIGAA, a
jornada, a atualização sobre a pasta de um professor, o rig S3, os dados dos
testes e a semana estável. A cópia da pasta que um professor envia para
investigar um problema fica dita, na 5.3, 5.5 e 8.3.

Co-Authored-By: Claude Opus 5.5 <noreply@anthropic.com>
</commit_message>
<xml_diff>
--- a/docs/Adsum-manual-e-LGPD.docx
+++ b/docs/Adsum-manual-e-LGPD.docx
@@ -115,7 +115,7 @@
           <w:sz w:val="20"/>
           <w:szCs w:val="20"/>
         </w:rPr>
-        <w:t xml:space="preserve">Willian Neves Rupert Jones</w:t>
+        <w:t xml:space="preserve">Criado por Prof. Paulo Freitas e Willian Rupert</w:t>
       </w:r>
     </w:p>
     <w:tbl>
@@ -330,6 +330,20 @@
           </w:pPr>
           <w:r>
             <w:t xml:space="default">2.6 Mais de uma turma</w:t>
+            <w:tab/>
+            <w:t xml:space="default"/>
+          </w:r>
+        </w:p>
+        <w:p>
+          <w:pPr>
+            <w:pStyle w:val="TOC2"/>
+            <w:tabs>
+              <w:tab w:val="clear" w:pos="8786"/>
+              <w:tab w:val="right" w:pos="9025" w:leader="dot"/>
+            </w:tabs>
+          </w:pPr>
+          <w:r>
+            <w:t xml:space="default">2.7 Lançar no SIGAA (em teste)</w:t>
             <w:tab/>
             <w:t xml:space="default"/>
           </w:r>
@@ -571,6 +585,76 @@
             <w:tab/>
             <w:t xml:space="default"/>
           </w:r>
+        </w:p>
+        <w:p>
+          <w:pPr>
+            <w:pStyle w:val="TOC1"/>
+            <w:tabs>
+              <w:tab w:val="clear" w:pos="9026"/>
+              <w:tab w:val="right" w:pos="9025" w:leader="dot"/>
+            </w:tabs>
+          </w:pPr>
+          <w:r>
+            <w:t xml:space="default">8. Como o Adsum é testado</w:t>
+            <w:tab/>
+            <w:t xml:space="default"/>
+          </w:r>
+        </w:p>
+        <w:p>
+          <w:pPr>
+            <w:pStyle w:val="TOC2"/>
+            <w:tabs>
+              <w:tab w:val="clear" w:pos="8786"/>
+              <w:tab w:val="right" w:pos="9025" w:leader="dot"/>
+            </w:tabs>
+          </w:pPr>
+          <w:r>
+            <w:t xml:space="default">8.1 O comando único</w:t>
+            <w:tab/>
+            <w:t xml:space="default"/>
+          </w:r>
+        </w:p>
+        <w:p>
+          <w:pPr>
+            <w:pStyle w:val="TOC2"/>
+            <w:tabs>
+              <w:tab w:val="clear" w:pos="8786"/>
+              <w:tab w:val="right" w:pos="9025" w:leader="dot"/>
+            </w:tabs>
+          </w:pPr>
+          <w:r>
+            <w:t xml:space="default">8.2 O dongle, de verdade</w:t>
+            <w:tab/>
+            <w:t xml:space="default"/>
+          </w:r>
+        </w:p>
+        <w:p>
+          <w:pPr>
+            <w:pStyle w:val="TOC2"/>
+            <w:tabs>
+              <w:tab w:val="clear" w:pos="8786"/>
+              <w:tab w:val="right" w:pos="9025" w:leader="dot"/>
+            </w:tabs>
+          </w:pPr>
+          <w:r>
+            <w:t xml:space="default">8.3 Os dados dos testes</w:t>
+            <w:tab/>
+            <w:t xml:space="default"/>
+          </w:r>
+        </w:p>
+        <w:p>
+          <w:pPr>
+            <w:pStyle w:val="TOC2"/>
+            <w:tabs>
+              <w:tab w:val="clear" w:pos="8786"/>
+              <w:tab w:val="right" w:pos="9025" w:leader="dot"/>
+            </w:tabs>
+          </w:pPr>
+          <w:r>
+            <w:t xml:space="default">8.4 Quando uma versão vai ao ar</w:t>
+            <w:tab/>
+            <w:t xml:space="default"/>
+          </w:r>
           <w:r>
             <w:fldChar w:fldCharType="end"/>
           </w:r>
@@ -732,7 +816,7 @@
           <w:sz w:val="22"/>
           <w:szCs w:val="22"/>
         </w:rPr>
-        <w:t xml:space="preserve">Não é um sistema institucional de frequência, não substitui o SIGAA e não conversa com ele. É uma ferramenta de sala de aula que produz uma planilha, e o que se faz com essa planilha continua sendo o processo de sempre.</w:t>
+        <w:t xml:space="preserve">Não é um sistema institucional de frequência e não substitui o SIGAA. É uma ferramenta de sala de aula que produz uma planilha. Há um caminho para levar essa planilha à frequência do SIGAA (seção 2.7), ainda em teste e desligado por padrão; nele, quem grava no SIGAA é sempre o professor.</w:t>
       </w:r>
     </w:p>
     <w:p>
@@ -868,6 +952,28 @@
           <w:sz w:val="22"/>
           <w:szCs w:val="22"/>
         </w:rPr>
+        <w:t xml:space="preserve">O leitor de crachá. </w:t>
+      </w:r>
+      <w:r>
+        <w:rPr>
+          <w:sz w:val="22"/>
+          <w:szCs w:val="22"/>
+        </w:rPr>
+        <w:t xml:space="preserve">O Adsum precisa de um leitor de crachá USB de 13,56 MHz na mesa, ligado ao computador. Ele funciona como um teclado: liga na USB e lê, sem driver e sem instalação, no Mac, no Windows e no Linux. A primeira tela do Adsum mostra o leitor testado e recomendado, desenhado, e os Ajustes repetem a orientação em "O leitor de crachá". Durante a chamada, a janela do Adsum precisa estar na frente: o leitor digita onde estiver o cursor.</w:t>
+      </w:r>
+    </w:p>
+    <w:p>
+      <w:pPr>
+        <w:widowControl/>
+        <w:spacing w:after="160" w:line="276"/>
+      </w:pPr>
+      <w:r>
+        <w:rPr>
+          <w:b/>
+          <w:bCs/>
+          <w:sz w:val="22"/>
+          <w:szCs w:val="22"/>
+        </w:rPr>
         <w:t xml:space="preserve">Escolher onde guardar. </w:t>
       </w:r>
       <w:r>
@@ -1115,6 +1221,28 @@
       </w:pPr>
       <w:r>
         <w:rPr>
+          <w:b/>
+          <w:bCs/>
+          <w:sz w:val="22"/>
+          <w:szCs w:val="22"/>
+        </w:rPr>
+        <w:t xml:space="preserve">Aluno de outra turma. </w:t>
+      </w:r>
+      <w:r>
+        <w:rPr>
+          <w:sz w:val="22"/>
+          <w:szCs w:val="22"/>
+        </w:rPr>
+        <w:t xml:space="preserve">Um crachá de aluno cadastrado em outra turma, encostado nesta chamada, não conta presença. A tela diz de qual turma ele é ("… é da turma X, não desta. A presença não foi contada."), e a linha fica no registro, com o motivo. Quem está matriculado nas duas turmas conta normalmente. O crachá de um professor não passa por essa regra: em qualquer turma ele é professor, e serve para abrir e encerrar a chamada, nunca para contar presença.</w:t>
+      </w:r>
+    </w:p>
+    <w:p>
+      <w:pPr>
+        <w:widowControl/>
+        <w:spacing w:after="160" w:line="276"/>
+      </w:pPr>
+      <w:r>
+        <w:rPr>
           <w:sz w:val="22"/>
           <w:szCs w:val="22"/>
         </w:rPr>
@@ -1220,6 +1348,204 @@
           <w:szCs w:val="22"/>
         </w:rPr>
         <w:t xml:space="preserve">Uma segunda turma se cadastra pelo mesmo caminho do primeiro dia: "Cadastrar nova turma", na tela inicial. As setas da tela inicial passam por todas as turmas cadastradas, e a grade só sugere qual mostrar primeiro: se ela apontar duas turmas no mesmo horário, nenhuma ganha o ponto azul, e o professor escolhe.</w:t>
+      </w:r>
+    </w:p>
+    <w:p>
+      <w:pPr>
+        <w:pStyle w:val="Heading2"/>
+        <w:keepNext/>
+        <w:keepLines/>
+        <w:widowControl/>
+        <w:spacing w:after="140" w:before="320"/>
+      </w:pPr>
+      <w:r>
+        <w:t xml:space="preserve">2.7 Lançar no SIGAA (em teste)</w:t>
+      </w:r>
+    </w:p>
+    <w:tbl>
+      <w:tblPr>
+        <w:tblW w:type="dxa" w:w="9026"/>
+        <w:tblBorders>
+          <w:top w:val="none" w:color="FFFFFF" w:sz="0"/>
+          <w:left w:val="none" w:color="FFFFFF" w:sz="0"/>
+          <w:bottom w:val="none" w:color="FFFFFF" w:sz="0"/>
+          <w:right w:val="none" w:color="FFFFFF" w:sz="0"/>
+          <w:insideH w:val="none" w:color="FFFFFF" w:sz="0"/>
+          <w:insideV w:val="none" w:color="FFFFFF" w:sz="0"/>
+        </w:tblBorders>
+      </w:tblPr>
+      <w:tblGrid>
+        <w:gridCol w:w="9026"/>
+      </w:tblGrid>
+      <w:tr>
+        <w:trPr>
+          <w:cantSplit/>
+        </w:trPr>
+        <w:tc>
+          <w:tcPr>
+            <w:tcW w:type="dxa" w:w="9026"/>
+            <w:shd w:fill="F5F5F7" w:color="auto" w:val="clear"/>
+            <w:tcMar>
+              <w:top w:type="dxa" w:w="200"/>
+              <w:left w:type="dxa" w:w="240"/>
+              <w:bottom w:type="dxa" w:w="200"/>
+              <w:right w:type="dxa" w:w="240"/>
+            </w:tcMar>
+          </w:tcPr>
+          <w:p>
+            <w:pPr>
+              <w:widowControl/>
+              <w:spacing w:after="0"/>
+            </w:pPr>
+            <w:r>
+              <w:rPr>
+                <w:b/>
+                <w:bCs/>
+                <w:sz w:val="22"/>
+                <w:szCs w:val="22"/>
+              </w:rPr>
+              <w:t xml:space="preserve">Em teste, desligado por padrão. </w:t>
+            </w:r>
+            <w:r>
+              <w:rPr>
+                <w:sz w:val="22"/>
+                <w:szCs w:val="22"/>
+              </w:rPr>
+              <w:t xml:space="preserve">Este caminho está pronto e testado, mas ainda passa por semanas de uso só para conferência antes de preencher qualquer coisa na frequência de uma turma real. Ele nunca toca em senha: o professor entra no SIGAA como sempre.</w:t>
+            </w:r>
+          </w:p>
+        </w:tc>
+      </w:tr>
+    </w:tbl>
+    <w:p>
+      <w:pPr>
+        <w:widowControl/>
+        <w:spacing w:after="160" w:line="276"/>
+      </w:pPr>
+      <w:r>
+        <w:rPr>
+          <w:sz w:val="22"/>
+          <w:szCs w:val="22"/>
+        </w:rPr>
+        <w:t xml:space="preserve"/>
+      </w:r>
+    </w:p>
+    <w:p>
+      <w:pPr>
+        <w:widowControl/>
+        <w:spacing w:after="160" w:line="276"/>
+      </w:pPr>
+      <w:r>
+        <w:rPr>
+          <w:b/>
+          <w:bCs/>
+          <w:sz w:val="22"/>
+          <w:szCs w:val="22"/>
+        </w:rPr>
+        <w:t xml:space="preserve">O favorito. </w:t>
+      </w:r>
+      <w:r>
+        <w:rPr>
+          <w:sz w:val="22"/>
+          <w:szCs w:val="22"/>
+        </w:rPr>
+        <w:t xml:space="preserve">Nos Ajustes há um botão "Adsum" para arrastar até a barra de favoritos do navegador. No SIGAA, na tela </w:t>
+      </w:r>
+      <w:r>
+        <w:rPr>
+          <w:rFonts w:ascii="Courier New" w:cs="Courier New" w:eastAsia="Courier New" w:hAnsi="Courier New"/>
+          <w:sz w:val="20"/>
+          <w:szCs w:val="20"/>
+        </w:rPr>
+        <w:t xml:space="preserve">Lançar Freq. em Planilha</w:t>
+      </w:r>
+      <w:r>
+        <w:rPr>
+          <w:sz w:val="22"/>
+          <w:szCs w:val="22"/>
+        </w:rPr>
+        <w:t xml:space="preserve"> da turma, um clique nesse favorito lê a planilha que está na tela e abre a janela do Adsum ao lado.</w:t>
+      </w:r>
+    </w:p>
+    <w:p>
+      <w:pPr>
+        <w:widowControl/>
+        <w:spacing w:after="160" w:line="276"/>
+      </w:pPr>
+      <w:r>
+        <w:rPr>
+          <w:b/>
+          <w:bCs/>
+          <w:sz w:val="22"/>
+          <w:szCs w:val="22"/>
+        </w:rPr>
+        <w:t xml:space="preserve">A conferência. </w:t>
+      </w:r>
+      <w:r>
+        <w:rPr>
+          <w:sz w:val="22"/>
+          <w:szCs w:val="22"/>
+        </w:rPr>
+        <w:t xml:space="preserve">A janela compara a planilha com as chamadas do Adsum, aluno por aluno, pela matrícula, e diz o estado numa frase: "Tudo confere", ou quantas aulas há para lançar, com presentes e faltas de cada uma. O que o SIGAA já tem nunca é alterado: aula já lançada é do professor. Onde o SIGAA e o Adsum discordam, um cartão fechado diz quantas diferenças são, de quantos alunos, em quantas aulas; aberto, mostra cada uma, e o professor pode aceitar o valor do SIGAA.</w:t>
+      </w:r>
+    </w:p>
+    <w:p>
+      <w:pPr>
+        <w:widowControl/>
+        <w:spacing w:after="160" w:line="276"/>
+      </w:pPr>
+      <w:r>
+        <w:rPr>
+          <w:b/>
+          <w:bCs/>
+          <w:sz w:val="22"/>
+          <w:szCs w:val="22"/>
+        </w:rPr>
+        <w:t xml:space="preserve">Preencher. </w:t>
+      </w:r>
+      <w:r>
+        <w:rPr>
+          <w:sz w:val="22"/>
+          <w:szCs w:val="22"/>
+        </w:rPr>
+        <w:t xml:space="preserve">Escolhidas as aulas, "Preencher" escreve as células vazias na planilha: presença vale 0, falta vale o número de aulas daquele dia (2, 4, 12). O que foi preenchido fica em azul, e as faltas em azul forte, para conferir de olho. Até a planilha salvar, dá para desfazer. Depois, quem grava é o SIGAA: sozinho, em até 5 minutos, ou no botão Gravar Frequências, que é do professor.</w:t>
+      </w:r>
+    </w:p>
+    <w:p>
+      <w:pPr>
+        <w:widowControl/>
+        <w:spacing w:after="160" w:line="276"/>
+      </w:pPr>
+      <w:r>
+        <w:rPr>
+          <w:b/>
+          <w:bCs/>
+          <w:sz w:val="22"/>
+          <w:szCs w:val="22"/>
+        </w:rPr>
+        <w:t xml:space="preserve">Clicar no favorito de novo </w:t>
+      </w:r>
+      <w:r>
+        <w:rPr>
+          <w:sz w:val="22"/>
+          <w:szCs w:val="22"/>
+        </w:rPr>
+        <w:t xml:space="preserve">depois de gravar é a conferência final: a janela deve dizer "Tudo confere". Cada preenchimento e cada diferença aceita ficam registrados na pasta, em </w:t>
+      </w:r>
+      <w:r>
+        <w:rPr>
+          <w:rFonts w:ascii="Courier New" w:cs="Courier New" w:eastAsia="Courier New" w:hAnsi="Courier New"/>
+          <w:sz w:val="20"/>
+          <w:szCs w:val="20"/>
+        </w:rPr>
+        <w:t xml:space="preserve">sigaa/&lt;turma&gt;.csv</w:t>
+      </w:r>
+      <w:r>
+        <w:rPr>
+          <w:sz w:val="22"/>
+          <w:szCs w:val="22"/>
+        </w:rPr>
+        <w:t xml:space="preserve">.</w:t>
       </w:r>
     </w:p>
     <w:p>
@@ -1694,7 +2020,59 @@
                 <w:sz w:val="20"/>
                 <w:szCs w:val="20"/>
               </w:rPr>
-              <w:t xml:space="preserve">A planilha para entregar: aluno por linha, nome completo e matrícula, um dia de aula por coluna, faltas contadas. Recalculada a cada mudança a partir de registros/.</w:t>
+              <w:t xml:space="preserve">A planilha para entregar: aluno por linha, nome completo e matrícula, um dia de aula por coluna, faltas contadas. Recalculada a cada mudança a partir de registros/. A coluna de matrícula aparece sozinha na primeira vez que a versão nova abre a pasta.</w:t>
+            </w:r>
+          </w:p>
+        </w:tc>
+      </w:tr>
+      <w:tr>
+        <w:trPr>
+          <w:cantSplit/>
+        </w:trPr>
+        <w:tc>
+          <w:tcPr>
+            <w:tcW w:type="dxa" w:w="2400"/>
+            <w:tcMar>
+              <w:top w:type="dxa" w:w="120"/>
+              <w:left w:type="dxa" w:w="160"/>
+              <w:bottom w:type="dxa" w:w="120"/>
+              <w:right w:type="dxa" w:w="160"/>
+            </w:tcMar>
+          </w:tcPr>
+          <w:p>
+            <w:pPr>
+              <w:spacing w:after="0" w:line="260"/>
+            </w:pPr>
+            <w:r>
+              <w:rPr>
+                <w:rFonts w:ascii="Courier New" w:cs="Courier New" w:eastAsia="Courier New" w:hAnsi="Courier New"/>
+                <w:sz w:val="20"/>
+                <w:szCs w:val="20"/>
+              </w:rPr>
+              <w:t xml:space="preserve">sigaa/</w:t>
+            </w:r>
+          </w:p>
+        </w:tc>
+        <w:tc>
+          <w:tcPr>
+            <w:tcW w:type="dxa" w:w="6626"/>
+            <w:tcMar>
+              <w:top w:type="dxa" w:w="120"/>
+              <w:left w:type="dxa" w:w="160"/>
+              <w:bottom w:type="dxa" w:w="120"/>
+              <w:right w:type="dxa" w:w="160"/>
+            </w:tcMar>
+          </w:tcPr>
+          <w:p>
+            <w:pPr>
+              <w:spacing w:after="0" w:line="260"/>
+            </w:pPr>
+            <w:r>
+              <w:rPr>
+                <w:sz w:val="20"/>
+                <w:szCs w:val="20"/>
+              </w:rPr>
+              <w:t xml:space="preserve">O registro do lançamento no SIGAA (seção 2.7): cada célula preenchida e cada diferença aceita, com data e hora. Só cresce.</w:t>
             </w:r>
           </w:p>
         </w:tc>
@@ -2785,7 +3163,7 @@
                 <w:sz w:val="20"/>
                 <w:szCs w:val="20"/>
               </w:rPr>
-              <w:t xml:space="preserve">ok, duplicado, desconhecido, rapido_demais, removido</w:t>
+              <w:t xml:space="preserve">ok, duplicado, desconhecido, rapido_demais, removido, outra_turma</w:t>
             </w:r>
           </w:p>
         </w:tc>
@@ -2925,7 +3303,7 @@
           <w:sz w:val="22"/>
           <w:szCs w:val="22"/>
         </w:rPr>
-        <w:t xml:space="preserve">Dois valores de </w:t>
+        <w:t xml:space="preserve">Três valores de </w:t>
       </w:r>
       <w:r>
         <w:rPr>
@@ -2940,7 +3318,7 @@
           <w:sz w:val="22"/>
           <w:szCs w:val="22"/>
         </w:rPr>
-        <w:t xml:space="preserve"> são recentes, e os dois são a mesma disciplina: até o crachá sendo recusado, ou uma marcação sendo desfeita, vira linha — nunca silêncio. </w:t>
+        <w:t xml:space="preserve"> são recentes, e os três são a mesma disciplina: até o crachá sendo recusado, ou uma marcação sendo desfeita, vira linha — nunca silêncio. </w:t>
       </w:r>
       <w:r>
         <w:rPr>
@@ -2970,7 +3348,22 @@
           <w:sz w:val="22"/>
           <w:szCs w:val="22"/>
         </w:rPr>
-        <w:t xml:space="preserve"> é o professor tirando à mão, na planilha, uma presença que não devia ter sido contada — a leitura original do crachá continua no arquivo, só deixa de valer como presença.</w:t>
+        <w:t xml:space="preserve"> é o professor tirando à mão, na planilha, uma presença que não devia ter sido contada — a leitura original do crachá continua no arquivo, só deixa de valer como presença. </w:t>
+      </w:r>
+      <w:r>
+        <w:rPr>
+          <w:rFonts w:ascii="Courier New" w:cs="Courier New" w:eastAsia="Courier New" w:hAnsi="Courier New"/>
+          <w:sz w:val="20"/>
+          <w:szCs w:val="20"/>
+        </w:rPr>
+        <w:t xml:space="preserve">outra_turma</w:t>
+      </w:r>
+      <w:r>
+        <w:rPr>
+          <w:sz w:val="22"/>
+          <w:szCs w:val="22"/>
+        </w:rPr>
+        <w:t xml:space="preserve"> é o crachá de um aluno de outra turma encostado nesta chamada (seção 2.3): fica com nome e matrícula, e não conta presença.</w:t>
       </w:r>
     </w:p>
     <w:p>
@@ -3979,7 +4372,7 @@
           <w:sz w:val="22"/>
           <w:szCs w:val="22"/>
         </w:rPr>
-        <w:t xml:space="preserve">é a ferramenta. Não é um serviço, não tem operador remoto, não recebe nem transmite dado, e seu autor não tem acesso a base nenhuma.</w:t>
+        <w:t xml:space="preserve">é a ferramenta. Não é um serviço, não tem operador remoto, não recebe nem transmite dado, e seu autor não tem acesso a base nenhuma, a não ser a cópia que um professor lhe envie para investigar um problema (seção 8.3).</w:t>
       </w:r>
     </w:p>
     <w:p>
@@ -4068,7 +4461,7 @@
           <w:sz w:val="22"/>
           <w:szCs w:val="22"/>
         </w:rPr>
-        <w:t xml:space="preserve">Todo compartilhamento é gesto explícito do professor: exportar a planilha e entregá-la a quem de direito. Há também uma função de passar os crachás vinculados a outro professor; ela leva o sal junto, necessariamente, e a tela avisa que o arquivo liga crachás a pessoas e merece o mesmo cuidado que a lista da turma.</w:t>
+        <w:t xml:space="preserve">Todo compartilhamento é gesto explícito do professor: exportar a planilha e entregá-la a quem de direito, ou enviar ao autor uma cópia da pasta para investigar um problema (o que acontece com ela está na seção 8.3). Há também uma função de passar os crachás vinculados a outro professor; ela leva o sal junto, necessariamente, e a tela avisa que o arquivo liga crachás a pessoas e merece o mesmo cuidado que a lista da turma.</w:t>
       </w:r>
     </w:p>
     <w:p>
@@ -4913,7 +5306,7 @@
                 <w:sz w:val="20"/>
                 <w:szCs w:val="20"/>
               </w:rPr>
-              <w:t xml:space="preserve">Uma presença foi marcada errada</w:t>
+              <w:t xml:space="preserve">Um aluno de outra turma encostou o crachá</w:t>
             </w:r>
           </w:p>
         </w:tc>
@@ -4936,7 +5329,7 @@
                 <w:sz w:val="20"/>
                 <w:szCs w:val="20"/>
               </w:rPr>
-              <w:t xml:space="preserve">Corrige-se na planilha (Ajustes › Presenças), no modo Editar: a presença vira falta com um toque, sem apagar a leitura original do crachá.</w:t>
+              <w:t xml:space="preserve">A tela diz de qual turma ele é, e a presença não conta. A linha fica no registro, com o motivo.</w:t>
             </w:r>
           </w:p>
         </w:tc>
@@ -4964,6 +5357,108 @@
                 <w:sz w:val="20"/>
                 <w:szCs w:val="20"/>
               </w:rPr>
+              <w:t xml:space="preserve">Outra janela do Adsum foi aberta no meio da aula</w:t>
+            </w:r>
+          </w:p>
+        </w:tc>
+        <w:tc>
+          <w:tcPr>
+            <w:tcW w:type="dxa" w:w="6426"/>
+            <w:tcMar>
+              <w:top w:type="dxa" w:w="120"/>
+              <w:left w:type="dxa" w:w="160"/>
+              <w:bottom w:type="dxa" w:w="120"/>
+              <w:right w:type="dxa" w:w="160"/>
+            </w:tcMar>
+          </w:tcPr>
+          <w:p>
+            <w:pPr>
+              <w:spacing w:after="0" w:line="260"/>
+            </w:pPr>
+            <w:r>
+              <w:rPr>
+                <w:sz w:val="20"/>
+                <w:szCs w:val="20"/>
+              </w:rPr>
+              <w:t xml:space="preserve">A chamada continua na primeira janela e a fila segue contando. Fechar o Adsum ainda fecha a chamada; abrir outra janela, não.</w:t>
+            </w:r>
+          </w:p>
+        </w:tc>
+      </w:tr>
+      <w:tr>
+        <w:trPr>
+          <w:cantSplit/>
+        </w:trPr>
+        <w:tc>
+          <w:tcPr>
+            <w:tcW w:type="dxa" w:w="2600"/>
+            <w:tcMar>
+              <w:top w:type="dxa" w:w="120"/>
+              <w:left w:type="dxa" w:w="160"/>
+              <w:bottom w:type="dxa" w:w="120"/>
+              <w:right w:type="dxa" w:w="160"/>
+            </w:tcMar>
+          </w:tcPr>
+          <w:p>
+            <w:pPr>
+              <w:spacing w:after="0" w:line="260"/>
+            </w:pPr>
+            <w:r>
+              <w:rPr>
+                <w:sz w:val="20"/>
+                <w:szCs w:val="20"/>
+              </w:rPr>
+              <w:t xml:space="preserve">Uma presença foi marcada errada</w:t>
+            </w:r>
+          </w:p>
+        </w:tc>
+        <w:tc>
+          <w:tcPr>
+            <w:tcW w:type="dxa" w:w="6426"/>
+            <w:tcMar>
+              <w:top w:type="dxa" w:w="120"/>
+              <w:left w:type="dxa" w:w="160"/>
+              <w:bottom w:type="dxa" w:w="120"/>
+              <w:right w:type="dxa" w:w="160"/>
+            </w:tcMar>
+          </w:tcPr>
+          <w:p>
+            <w:pPr>
+              <w:spacing w:after="0" w:line="260"/>
+            </w:pPr>
+            <w:r>
+              <w:rPr>
+                <w:sz w:val="20"/>
+                <w:szCs w:val="20"/>
+              </w:rPr>
+              <w:t xml:space="preserve">Corrige-se na planilha (Ajustes › Presenças), no modo Editar: a presença vira falta com um toque, sem apagar a leitura original do crachá.</w:t>
+            </w:r>
+          </w:p>
+        </w:tc>
+      </w:tr>
+      <w:tr>
+        <w:trPr>
+          <w:cantSplit/>
+        </w:trPr>
+        <w:tc>
+          <w:tcPr>
+            <w:tcW w:type="dxa" w:w="2600"/>
+            <w:tcMar>
+              <w:top w:type="dxa" w:w="120"/>
+              <w:left w:type="dxa" w:w="160"/>
+              <w:bottom w:type="dxa" w:w="120"/>
+              <w:right w:type="dxa" w:w="160"/>
+            </w:tcMar>
+          </w:tcPr>
+          <w:p>
+            <w:pPr>
+              <w:spacing w:after="0" w:line="260"/>
+            </w:pPr>
+            <w:r>
+              <w:rPr>
+                <w:sz w:val="20"/>
+                <w:szCs w:val="20"/>
+              </w:rPr>
               <w:t xml:space="preserve">Trocou de navegador ou limpou os dados</w:t>
             </w:r>
           </w:p>
@@ -5206,6 +5701,338 @@
           <w:szCs w:val="22"/>
         </w:rPr>
         <w:t xml:space="preserve">Nesses navegadores o programa não consegue gravar sozinho, e o professor precisa exportar. O programa cobra, mas não obriga.</w:t>
+      </w:r>
+    </w:p>
+    <w:p>
+      <w:pPr>
+        <w:pStyle w:val="Heading1"/>
+        <w:keepNext/>
+        <w:keepLines/>
+        <w:pageBreakBefore/>
+        <w:widowControl/>
+        <w:spacing w:after="200" w:before="400"/>
+      </w:pPr>
+      <w:r>
+        <w:t xml:space="preserve">8. Como o Adsum é testado</w:t>
+      </w:r>
+    </w:p>
+    <w:p>
+      <w:pPr>
+        <w:widowControl/>
+        <w:spacing w:after="160" w:line="276"/>
+      </w:pPr>
+      <w:r>
+        <w:rPr>
+          <w:sz w:val="22"/>
+          <w:szCs w:val="22"/>
+        </w:rPr>
+        <w:t xml:space="preserve">Três semanas de falhas em sala, em setembro de 2026, mostraram que o difícil não era escrever o programa: era provar que ele funciona antes de encontrar uma turma. Desde então, nenhuma versão vai ao ar sem passar pelo que este capítulo descreve.</w:t>
+      </w:r>
+    </w:p>
+    <w:p>
+      <w:pPr>
+        <w:pStyle w:val="Heading2"/>
+        <w:keepNext/>
+        <w:keepLines/>
+        <w:widowControl/>
+        <w:spacing w:after="140" w:before="320"/>
+      </w:pPr>
+      <w:r>
+        <w:t xml:space="preserve">8.1 O comando único</w:t>
+      </w:r>
+    </w:p>
+    <w:p>
+      <w:pPr>
+        <w:widowControl/>
+        <w:spacing w:after="160" w:line="276"/>
+      </w:pPr>
+      <w:r>
+        <w:rPr>
+          <w:sz w:val="22"/>
+          <w:szCs w:val="22"/>
+        </w:rPr>
+        <w:t xml:space="preserve">Tudo o que é automático roda num comando só, </w:t>
+      </w:r>
+      <w:r>
+        <w:rPr>
+          <w:rFonts w:ascii="Courier New" w:cs="Courier New" w:eastAsia="Courier New" w:hAnsi="Courier New"/>
+          <w:sz w:val="20"/>
+          <w:szCs w:val="20"/>
+        </w:rPr>
+        <w:t xml:space="preserve">npm run verificar</w:t>
+      </w:r>
+      <w:r>
+        <w:rPr>
+          <w:sz w:val="22"/>
+          <w:szCs w:val="22"/>
+        </w:rPr>
+        <w:t xml:space="preserve">, no computador do autor. Ele para na primeira falha e, no fim, abre um relatório com o vídeo de cada teste feito no navegador. Um teste que não rodou por falta de dados aparece como pulado, nunca como aprovado. As etapas, em ordem:</w:t>
+      </w:r>
+    </w:p>
+    <w:p>
+      <w:pPr>
+        <w:pStyle w:val="ListParagraph"/>
+        <w:widowControl/>
+        <w:numPr>
+          <w:ilvl w:val="0"/>
+          <w:numId w:val="2"/>
+        </w:numPr>
+        <w:spacing w:after="100" w:line="276"/>
+      </w:pPr>
+      <w:r>
+        <w:rPr>
+          <w:b/>
+          <w:bCs/>
+          <w:sz w:val="22"/>
+          <w:szCs w:val="22"/>
+        </w:rPr>
+        <w:t xml:space="preserve">Testes de unidade. </w:t>
+      </w:r>
+      <w:r>
+        <w:rPr>
+          <w:sz w:val="22"/>
+          <w:szCs w:val="22"/>
+        </w:rPr>
+        <w:t xml:space="preserve">Cada regra do programa, isolada: o resumo do crachá, a leitura da lista do SIGAA, a chamada, a planilha de faltas, a conciliação com o SIGAA. As telas são testadas com o mesmo código de banco de dados que o programa usa, e não com uma imitação que concorda com tudo.</w:t>
+      </w:r>
+    </w:p>
+    <w:p>
+      <w:pPr>
+        <w:pStyle w:val="ListParagraph"/>
+        <w:widowControl/>
+        <w:numPr>
+          <w:ilvl w:val="0"/>
+          <w:numId w:val="2"/>
+        </w:numPr>
+        <w:spacing w:after="100" w:line="276"/>
+      </w:pPr>
+      <w:r>
+        <w:rPr>
+          <w:b/>
+          <w:bCs/>
+          <w:sz w:val="22"/>
+          <w:szCs w:val="22"/>
+        </w:rPr>
+        <w:t xml:space="preserve">Testes de mutação. </w:t>
+      </w:r>
+      <w:r>
+        <w:rPr>
+          <w:sz w:val="22"/>
+          <w:szCs w:val="22"/>
+        </w:rPr>
+        <w:t xml:space="preserve">Para saber se os testes pegam defeito, uma ferramenta altera o código de propósito, uma pequena mudança por vez, e confere se algum teste falha. A parte que lança no SIGAA passou por isso, e cada alteração que nenhum teste percebia ganhou um teste.</w:t>
+      </w:r>
+    </w:p>
+    <w:p>
+      <w:pPr>
+        <w:pStyle w:val="ListParagraph"/>
+        <w:widowControl/>
+        <w:numPr>
+          <w:ilvl w:val="0"/>
+          <w:numId w:val="2"/>
+        </w:numPr>
+        <w:spacing w:after="100" w:line="276"/>
+      </w:pPr>
+      <w:r>
+        <w:rPr>
+          <w:b/>
+          <w:bCs/>
+          <w:sz w:val="22"/>
+          <w:szCs w:val="22"/>
+        </w:rPr>
+        <w:t xml:space="preserve">A planilha do SIGAA, de verdade. </w:t>
+      </w:r>
+      <w:r>
+        <w:rPr>
+          <w:sz w:val="22"/>
+          <w:szCs w:val="22"/>
+        </w:rPr>
+        <w:t xml:space="preserve">O favorito roda no Google Chrome sobre uma cópia anonimizada da planilha de frequência, com os scripts do próprio SIGAA. O teste preenche, desfaz, grava e confere que o SIGAA receberia exatamente as células prometidas, e nenhuma outra. Também adianta o relógio em 5 minutos, para ver o salvamento automático do SIGAA levar o preenchimento sozinho.</w:t>
+      </w:r>
+    </w:p>
+    <w:p>
+      <w:pPr>
+        <w:pStyle w:val="ListParagraph"/>
+        <w:widowControl/>
+        <w:numPr>
+          <w:ilvl w:val="0"/>
+          <w:numId w:val="2"/>
+        </w:numPr>
+        <w:spacing w:after="100" w:line="276"/>
+      </w:pPr>
+      <w:r>
+        <w:rPr>
+          <w:b/>
+          <w:bCs/>
+          <w:sz w:val="22"/>
+          <w:szCs w:val="22"/>
+        </w:rPr>
+        <w:t xml:space="preserve">A jornada inteira. </w:t>
+      </w:r>
+      <w:r>
+        <w:rPr>
+          <w:sz w:val="22"/>
+          <w:szCs w:val="22"/>
+        </w:rPr>
+        <w:t xml:space="preserve">No Chrome, só pela tela e pelo crachá, como um professor usaria: chegar, escolher a pasta, colar a turma, três aulas com cada tipo de presença (busca, chamar nomes, repetido, presente e não presente à mão, dois crachás juntos, aluno de outra turma, crachá da professora), e por fim lançar no SIGAA. Cada célula enviada é conferida: presença vale 0, falta vale o número de aulas do dia.</w:t>
+      </w:r>
+    </w:p>
+    <w:p>
+      <w:pPr>
+        <w:pStyle w:val="ListParagraph"/>
+        <w:widowControl/>
+        <w:numPr>
+          <w:ilvl w:val="0"/>
+          <w:numId w:val="2"/>
+        </w:numPr>
+        <w:spacing w:after="100" w:line="276"/>
+      </w:pPr>
+      <w:r>
+        <w:rPr>
+          <w:b/>
+          <w:bCs/>
+          <w:sz w:val="22"/>
+          <w:szCs w:val="22"/>
+        </w:rPr>
+        <w:t xml:space="preserve">A máquina do professor atualizando. </w:t>
+      </w:r>
+      <w:r>
+        <w:rPr>
+          <w:sz w:val="22"/>
+          <w:szCs w:val="22"/>
+        </w:rPr>
+        <w:t xml:space="preserve">A versão que está no ar abre a pasta de um professor real, faz uma chamada com os crachás daquela turma, e a versão nova é publicada no meio da aula. O teste confere que a nova espera a chamada terminar, entra sozinha, e que nada sumiu: a base, o registro e cada crachá continuando a ser a mesma pessoa.</w:t>
+      </w:r>
+    </w:p>
+    <w:p>
+      <w:pPr>
+        <w:pStyle w:val="Heading2"/>
+        <w:keepNext/>
+        <w:keepLines/>
+        <w:widowControl/>
+        <w:spacing w:after="140" w:before="320"/>
+      </w:pPr>
+      <w:r>
+        <w:t xml:space="preserve">8.2 O dongle, de verdade</w:t>
+      </w:r>
+    </w:p>
+    <w:p>
+      <w:pPr>
+        <w:widowControl/>
+        <w:spacing w:after="160" w:line="276"/>
+      </w:pPr>
+      <w:r>
+        <w:rPr>
+          <w:sz w:val="22"/>
+          <w:szCs w:val="22"/>
+        </w:rPr>
+        <w:t xml:space="preserve">Nos testes no navegador, o crachá pode ser digitado pelo próprio teste ou por um aparelho: </w:t>
+      </w:r>
+      <w:r>
+        <w:rPr>
+          <w:rFonts w:ascii="Courier New" w:cs="Courier New" w:eastAsia="Courier New" w:hAnsi="Courier New"/>
+          <w:sz w:val="20"/>
+          <w:szCs w:val="20"/>
+        </w:rPr>
+        <w:t xml:space="preserve">npm run verificar:rig</w:t>
+      </w:r>
+      <w:r>
+        <w:rPr>
+          <w:sz w:val="22"/>
+          <w:szCs w:val="22"/>
+        </w:rPr>
+        <w:t xml:space="preserve"> usa uma placa ESP32-S3 que se apresenta ao computador como teclado USB e digita os números dos crachás no mesmo ritmo, medido, do leitor de verdade. Do conector USB para cima, o caminho é o mesmo do leitor: sistema operacional, janela, navegador e programa.</w:t>
+      </w:r>
+    </w:p>
+    <w:p>
+      <w:pPr>
+        <w:widowControl/>
+        <w:spacing w:after="160" w:line="276"/>
+      </w:pPr>
+      <w:r>
+        <w:rPr>
+          <w:sz w:val="22"/>
+          <w:szCs w:val="22"/>
+        </w:rPr>
+        <w:t xml:space="preserve">O que nenhum teste automático cobre fica num ensaio à mão, com o leitor de verdade: a leitura de rádio do próprio leitor e a permissão da pasta que o navegador pede ao reabrir.</w:t>
+      </w:r>
+    </w:p>
+    <w:p>
+      <w:pPr>
+        <w:pStyle w:val="Heading2"/>
+        <w:keepNext/>
+        <w:keepLines/>
+        <w:widowControl/>
+        <w:spacing w:after="140" w:before="320"/>
+      </w:pPr>
+      <w:r>
+        <w:t xml:space="preserve">8.3 Os dados dos testes</w:t>
+      </w:r>
+    </w:p>
+    <w:p>
+      <w:pPr>
+        <w:widowControl/>
+        <w:spacing w:after="160" w:line="276"/>
+      </w:pPr>
+      <w:r>
+        <w:rPr>
+          <w:sz w:val="22"/>
+          <w:szCs w:val="22"/>
+        </w:rPr>
+        <w:t xml:space="preserve">Os testes usam gente inventada, na forma exata das páginas reais. Quando um professor envia uma cópia da própria pasta para que um problema seja investigado — gesto dele, como qualquer compartilhamento (seção 5.5) —, essa cópia fica só no computador do autor, é usada para reproduzir o problema e para o teste de atualização, e só entra no repositório público depois de passar por um script de anonimização, que se recusa a gravar se sobrar um nome, matrícula, resumo ou sal original.</w:t>
+      </w:r>
+    </w:p>
+    <w:p>
+      <w:pPr>
+        <w:widowControl/>
+        <w:spacing w:after="160" w:line="276"/>
+      </w:pPr>
+      <w:r>
+        <w:rPr>
+          <w:sz w:val="22"/>
+          <w:szCs w:val="22"/>
+        </w:rPr>
+        <w:t xml:space="preserve">Durante os testes, nada sai do computador: o navegador do teste não chega à internet, e os endereços do Adsum e do SIGAA são atendidos pelo próprio teste.</w:t>
+      </w:r>
+    </w:p>
+    <w:p>
+      <w:pPr>
+        <w:pStyle w:val="Heading2"/>
+        <w:keepNext/>
+        <w:keepLines/>
+        <w:widowControl/>
+        <w:spacing w:after="140" w:before="320"/>
+      </w:pPr>
+      <w:r>
+        <w:t xml:space="preserve">8.4 Quando uma versão vai ao ar</w:t>
+      </w:r>
+    </w:p>
+    <w:p>
+      <w:pPr>
+        <w:widowControl/>
+        <w:spacing w:after="160" w:line="276"/>
+      </w:pPr>
+      <w:r>
+        <w:rPr>
+          <w:sz w:val="22"/>
+          <w:szCs w:val="22"/>
+        </w:rPr>
+        <w:t xml:space="preserve">Uma versão nova só é publicada depois de uma semana de funcionamento estável: sem mudança, com </w:t>
+      </w:r>
+      <w:r>
+        <w:rPr>
+          <w:rFonts w:ascii="Courier New" w:cs="Courier New" w:eastAsia="Courier New" w:hAnsi="Courier New"/>
+          <w:sz w:val="20"/>
+          <w:szCs w:val="20"/>
+        </w:rPr>
+        <w:t xml:space="preserve">npm run verificar</w:t>
+      </w:r>
+      <w:r>
+        <w:rPr>
+          <w:sz w:val="22"/>
+          <w:szCs w:val="22"/>
+        </w:rPr>
+        <w:t xml:space="preserve"> aprovado sobre ela, sem teste pulado, e com a cópia da pasta enviada pelo professor na sexta-feira sem nenhum erro no diário. A exceção é o conserto de uma falha observada em sala, que pode ir antes, com o ensaio completo logo depois. Toda falha em sala vira, antes do conserto, um teste que a reproduz.</w:t>
       </w:r>
     </w:p>
     <w:p>

</xml_diff>

<commit_message>
Lançar no SIGAA ligado para todos, com o Preencher
Decisão do autor em 01/10/2026: testar inteiro, em turmas reais, pede todas
as funções disponíveis. Sai a trava do modo de ensaio: o favorito aparece
nos Ajustes e a janela do SIGAA abre para todos. O que segura um
preenchimento errado é o Desfazer, antes do salvamento automático da
planilha, ou fechar a aba do SIGAA sem gravar, dentro dos 5 minutos: o
manual diz isso na 2.7. Portões C e D do docs/08 andam juntos.

Co-Authored-By: Claude Opus 5.5 <noreply@anthropic.com>
</commit_message>
<xml_diff>
--- a/docs/Adsum-manual-e-LGPD.docx
+++ b/docs/Adsum-manual-e-LGPD.docx
@@ -816,7 +816,7 @@
           <w:sz w:val="22"/>
           <w:szCs w:val="22"/>
         </w:rPr>
-        <w:t xml:space="preserve">Não é um sistema institucional de frequência e não substitui o SIGAA. É uma ferramenta de sala de aula que produz uma planilha. Há um caminho para levar essa planilha à frequência do SIGAA (seção 2.7), ainda em teste e desligado por padrão; nele, quem grava no SIGAA é sempre o professor.</w:t>
+        <w:t xml:space="preserve">Não é um sistema institucional de frequência e não substitui o SIGAA. É uma ferramenta de sala de aula que produz uma planilha, e tem um caminho para levar essa planilha à frequência do SIGAA (seção 2.7), ainda em teste. Nele, o Adsum preenche a planilha que o professor abriu, na sessão dele, e nunca toca em senha.</w:t>
       </w:r>
     </w:p>
     <w:p>
@@ -1404,14 +1404,14 @@
                 <w:sz w:val="22"/>
                 <w:szCs w:val="22"/>
               </w:rPr>
-              <w:t xml:space="preserve">Em teste, desligado por padrão. </w:t>
+              <w:t xml:space="preserve">Em teste, e ligado. </w:t>
             </w:r>
             <w:r>
               <w:rPr>
                 <w:sz w:val="22"/>
                 <w:szCs w:val="22"/>
               </w:rPr>
-              <w:t xml:space="preserve">Este caminho está pronto e testado, mas ainda passa por semanas de uso só para conferência antes de preencher qualquer coisa na frequência de uma turma real. Ele nunca toca em senha: o professor entra no SIGAA como sempre.</w:t>
+              <w:t xml:space="preserve">Este caminho está pronto e testado, e ligado para que seja posto à prova em turmas reais. Ele nunca toca em senha: o professor entra no SIGAA como sempre. O que o Adsum preenche, a própria planilha do SIGAA salva sozinha em até 5 minutos. Para voltar atrás antes disso: "Desfazer", na barra que aparece no pé da planilha, ou fechar a aba do SIGAA sem gravar.</w:t>
             </w:r>
           </w:p>
         </w:tc>

</xml_diff>

<commit_message>
Publicar logo depois de uma aula, com a volta pronta; a primeira semana de uso real é a semana estável
Decisão do autor em 01/10/2026: esperar uma semana com a versão nova parada
nesta máquina não a expõe a nada, porque o professor continua na anterior.
O que reduz o risco é o momento (depois de uma aula, nunca na véspera), a
volta pronta e provada, e ler os zips da primeira semana de uso real. O
pode-publicar passa a pedir o verificar nas últimas 24 horas, uma vez com o
rig, e pergunta o ensaio com o dongle, o zip mais recente e o momento. CLAUDE.md,
roadmap, docs/07 e o manual (8.4) acompanham.

Co-Authored-By: Claude Opus 5.5 <noreply@anthropic.com>
</commit_message>
<xml_diff>
--- a/docs/Adsum-manual-e-LGPD.docx
+++ b/docs/Adsum-manual-e-LGPD.docx
@@ -6017,7 +6017,7 @@
           <w:sz w:val="22"/>
           <w:szCs w:val="22"/>
         </w:rPr>
-        <w:t xml:space="preserve">Uma versão nova só é publicada depois de uma semana de funcionamento estável: sem mudança, com </w:t>
+        <w:t xml:space="preserve">Uma versão nova é publicada logo depois de uma aula, nunca na véspera de outra: com </w:t>
       </w:r>
       <w:r>
         <w:rPr>
@@ -6032,7 +6032,22 @@
           <w:sz w:val="22"/>
           <w:szCs w:val="22"/>
         </w:rPr>
-        <w:t xml:space="preserve"> aprovado sobre ela, sem teste pulado, e com a cópia da pasta enviada pelo professor na sexta-feira sem nenhum erro no diário. A exceção é o conserto de uma falha observada em sala, que pode ir antes, com o ensaio completo logo depois. Toda falha em sala vira, antes do conserto, um teste que a reproduz.</w:t>
+        <w:t xml:space="preserve"> aprovado sobre ela nas últimas 24 horas, uma vez com a placa no lugar do leitor, sem teste pulado, e com o ensaio feito com o leitor de verdade. A primeira semana de uso real é a semana de observação: a cópia da pasta enviada pelo professor na sexta-feira é lida, e qualquer problema nela é resolvido voltando à versão anterior, que o </w:t>
+      </w:r>
+      <w:r>
+        <w:rPr>
+          <w:rFonts w:ascii="Courier New" w:cs="Courier New" w:eastAsia="Courier New" w:hAnsi="Courier New"/>
+          <w:sz w:val="20"/>
+          <w:szCs w:val="20"/>
+        </w:rPr>
+        <w:t xml:space="preserve">npm run verificar</w:t>
+      </w:r>
+      <w:r>
+        <w:rPr>
+          <w:sz w:val="22"/>
+          <w:szCs w:val="22"/>
+        </w:rPr>
+        <w:t xml:space="preserve"> prova que abre a base atualizada. Toda falha em sala vira, antes do conserto, um teste que a reproduz.</w:t>
       </w:r>
     </w:p>
     <w:p>

</xml_diff>